<commit_message>
Update problem statement documentation
</commit_message>
<xml_diff>
--- a/docs/01_Problem statement and Background.docx
+++ b/docs/01_Problem statement and Background.docx
@@ -6122,15 +6122,7 @@
           <w:sz w:val="24"/>
           <w:szCs w:val="24"/>
         </w:rPr>
-        <w:t xml:space="preserve"> RESTful APIs using </w:t>
-      </w:r>
-      <w:r>
-        <w:rPr>
-          <w:rFonts w:ascii="Times New Roman" w:hAnsi="Times New Roman" w:cs="Times New Roman"/>
-          <w:sz w:val="24"/>
-          <w:szCs w:val="24"/>
-        </w:rPr>
-        <w:t>Fast API</w:t>
+        <w:t xml:space="preserve"> RESTful APIs using Fast API</w:t>
       </w:r>
     </w:p>
     <w:p>
@@ -6819,15 +6811,7 @@
           <w:sz w:val="24"/>
           <w:szCs w:val="24"/>
         </w:rPr>
-        <w:t>Fast API</w:t>
-      </w:r>
-      <w:r>
-        <w:rPr>
-          <w:rFonts w:ascii="Times New Roman" w:hAnsi="Times New Roman" w:cs="Times New Roman"/>
-          <w:sz w:val="24"/>
-          <w:szCs w:val="24"/>
-        </w:rPr>
-        <w:t xml:space="preserve"> Backend</w:t>
+        <w:t>Fast API Backend</w:t>
       </w:r>
     </w:p>
     <w:p>
@@ -7124,6 +7108,1816 @@
           <w:bCs/>
           <w:sz w:val="28"/>
           <w:szCs w:val="28"/>
+        </w:rPr>
+      </w:pPr>
+      <w:r>
+        <w:rPr>
+          <w:rFonts w:ascii="Times New Roman" w:hAnsi="Times New Roman" w:cs="Times New Roman"/>
+          <w:b/>
+          <w:bCs/>
+          <w:sz w:val="28"/>
+          <w:szCs w:val="28"/>
+        </w:rPr>
+        <w:t>BACKEND</w:t>
+      </w:r>
+    </w:p>
+    <w:p>
+      <w:pPr>
+        <w:jc w:val="both"/>
+        <w:rPr>
+          <w:rFonts w:ascii="Times New Roman" w:hAnsi="Times New Roman" w:cs="Times New Roman"/>
+          <w:sz w:val="24"/>
+          <w:szCs w:val="24"/>
+        </w:rPr>
+      </w:pPr>
+      <w:r>
+        <w:rPr>
+          <w:rFonts w:ascii="Times New Roman" w:hAnsi="Times New Roman" w:cs="Times New Roman"/>
+          <w:sz w:val="24"/>
+          <w:szCs w:val="24"/>
+        </w:rPr>
+        <w:t xml:space="preserve">The backend of the Urban Air Quality Intelligence Platform (UAQIP) is developed using </w:t>
+      </w:r>
+      <w:r>
+        <w:rPr>
+          <w:rFonts w:ascii="Times New Roman" w:hAnsi="Times New Roman" w:cs="Times New Roman"/>
+          <w:sz w:val="24"/>
+          <w:szCs w:val="24"/>
+        </w:rPr>
+        <w:t>Fast API</w:t>
+      </w:r>
+      <w:r>
+        <w:rPr>
+          <w:rFonts w:ascii="Times New Roman" w:hAnsi="Times New Roman" w:cs="Times New Roman"/>
+          <w:sz w:val="24"/>
+          <w:szCs w:val="24"/>
+        </w:rPr>
+        <w:t>, a high-performance Python web framework designed for building scalable RESTful APIs. It serves as the core processing layer of the application by collecting, processing, storing, and distributing environmental data to the frontend.</w:t>
+      </w:r>
+    </w:p>
+    <w:p>
+      <w:pPr>
+        <w:jc w:val="both"/>
+        <w:rPr>
+          <w:rFonts w:ascii="Times New Roman" w:hAnsi="Times New Roman" w:cs="Times New Roman"/>
+          <w:sz w:val="24"/>
+          <w:szCs w:val="24"/>
+        </w:rPr>
+      </w:pPr>
+      <w:r>
+        <w:rPr>
+          <w:rFonts w:ascii="Times New Roman" w:hAnsi="Times New Roman" w:cs="Times New Roman"/>
+          <w:sz w:val="24"/>
+          <w:szCs w:val="24"/>
+        </w:rPr>
+        <w:t>The backend follows a modular architecture, where different functionalities are organized into independent modules such as data collectors, API routes, repositories, configuration files, database management, and utility services. This modular organization improves maintainability, scalability, and simplifies future enhancements.</w:t>
+      </w:r>
+    </w:p>
+    <w:p>
+      <w:pPr>
+        <w:jc w:val="both"/>
+        <w:rPr>
+          <w:rFonts w:ascii="Times New Roman" w:hAnsi="Times New Roman" w:cs="Times New Roman"/>
+          <w:sz w:val="24"/>
+          <w:szCs w:val="24"/>
+        </w:rPr>
+      </w:pPr>
+      <w:r>
+        <w:rPr>
+          <w:rFonts w:ascii="Times New Roman" w:hAnsi="Times New Roman" w:cs="Times New Roman"/>
+          <w:sz w:val="24"/>
+          <w:szCs w:val="24"/>
+        </w:rPr>
+        <w:t xml:space="preserve">The platform integrates data from multiple external sources, including </w:t>
+      </w:r>
+      <w:r>
+        <w:rPr>
+          <w:rFonts w:ascii="Times New Roman" w:hAnsi="Times New Roman" w:cs="Times New Roman"/>
+          <w:sz w:val="24"/>
+          <w:szCs w:val="24"/>
+        </w:rPr>
+        <w:t>Open Weather</w:t>
+      </w:r>
+      <w:r>
+        <w:rPr>
+          <w:rFonts w:ascii="Times New Roman" w:hAnsi="Times New Roman" w:cs="Times New Roman"/>
+          <w:sz w:val="24"/>
+          <w:szCs w:val="24"/>
+        </w:rPr>
+        <w:t xml:space="preserve"> Air Pollution API, </w:t>
+      </w:r>
+      <w:r>
+        <w:rPr>
+          <w:rFonts w:ascii="Times New Roman" w:hAnsi="Times New Roman" w:cs="Times New Roman"/>
+          <w:sz w:val="24"/>
+          <w:szCs w:val="24"/>
+        </w:rPr>
+        <w:t>Open Weather</w:t>
+      </w:r>
+      <w:r>
+        <w:rPr>
+          <w:rFonts w:ascii="Times New Roman" w:hAnsi="Times New Roman" w:cs="Times New Roman"/>
+          <w:sz w:val="24"/>
+          <w:szCs w:val="24"/>
+        </w:rPr>
+        <w:t xml:space="preserve"> API, and TomTom Traffic API. The collected data undergoes validation and preprocessing before being stored in MongoDB and made available through RESTful APIs.</w:t>
+      </w:r>
+    </w:p>
+    <w:p>
+      <w:pPr>
+        <w:jc w:val="both"/>
+        <w:rPr>
+          <w:rFonts w:ascii="Times New Roman" w:hAnsi="Times New Roman" w:cs="Times New Roman"/>
+          <w:sz w:val="24"/>
+          <w:szCs w:val="24"/>
+        </w:rPr>
+      </w:pPr>
+      <w:r>
+        <w:rPr>
+          <w:rFonts w:ascii="Times New Roman" w:hAnsi="Times New Roman" w:cs="Times New Roman"/>
+          <w:sz w:val="24"/>
+          <w:szCs w:val="24"/>
+        </w:rPr>
+        <w:lastRenderedPageBreak/>
+        <w:t>The backend provides endpoints for retrieving real-time and historical environmental information, including Air Quality Index (AQI), weather conditions, traffic information, and integrated environmental data. The architecture also supports future integration of Artificial Intelligence (AI) modules for AQI forecasting, pollution source attribution, explainable AI, and intelligent decision-support systems.</w:t>
+      </w:r>
+    </w:p>
+    <w:p>
+      <w:pPr>
+        <w:jc w:val="both"/>
+        <w:rPr>
+          <w:rFonts w:ascii="Times New Roman" w:hAnsi="Times New Roman" w:cs="Times New Roman"/>
+          <w:sz w:val="24"/>
+          <w:szCs w:val="24"/>
+        </w:rPr>
+      </w:pPr>
+      <w:r>
+        <w:rPr>
+          <w:rFonts w:ascii="Times New Roman" w:hAnsi="Times New Roman" w:cs="Times New Roman"/>
+          <w:sz w:val="24"/>
+          <w:szCs w:val="24"/>
+        </w:rPr>
+        <w:t>Key Features</w:t>
+      </w:r>
+    </w:p>
+    <w:p>
+      <w:pPr>
+        <w:numPr>
+          <w:ilvl w:val="0"/>
+          <w:numId w:val="40"/>
+        </w:numPr>
+        <w:jc w:val="both"/>
+        <w:rPr>
+          <w:rFonts w:ascii="Times New Roman" w:hAnsi="Times New Roman" w:cs="Times New Roman"/>
+          <w:sz w:val="24"/>
+          <w:szCs w:val="24"/>
+        </w:rPr>
+      </w:pPr>
+      <w:r>
+        <w:rPr>
+          <w:rFonts w:ascii="Times New Roman" w:hAnsi="Times New Roman" w:cs="Times New Roman"/>
+          <w:sz w:val="24"/>
+          <w:szCs w:val="24"/>
+        </w:rPr>
+        <w:t>Fast</w:t>
+      </w:r>
+      <w:r>
+        <w:rPr>
+          <w:rFonts w:ascii="Times New Roman" w:hAnsi="Times New Roman" w:cs="Times New Roman"/>
+          <w:sz w:val="24"/>
+          <w:szCs w:val="24"/>
+        </w:rPr>
+        <w:t xml:space="preserve"> </w:t>
+      </w:r>
+      <w:r>
+        <w:rPr>
+          <w:rFonts w:ascii="Times New Roman" w:hAnsi="Times New Roman" w:cs="Times New Roman"/>
+          <w:sz w:val="24"/>
+          <w:szCs w:val="24"/>
+        </w:rPr>
+        <w:t xml:space="preserve">API-based RESTful services </w:t>
+      </w:r>
+    </w:p>
+    <w:p>
+      <w:pPr>
+        <w:numPr>
+          <w:ilvl w:val="0"/>
+          <w:numId w:val="40"/>
+        </w:numPr>
+        <w:jc w:val="both"/>
+        <w:rPr>
+          <w:rFonts w:ascii="Times New Roman" w:hAnsi="Times New Roman" w:cs="Times New Roman"/>
+          <w:sz w:val="24"/>
+          <w:szCs w:val="24"/>
+        </w:rPr>
+      </w:pPr>
+      <w:r>
+        <w:rPr>
+          <w:rFonts w:ascii="Times New Roman" w:hAnsi="Times New Roman" w:cs="Times New Roman"/>
+          <w:sz w:val="24"/>
+          <w:szCs w:val="24"/>
+        </w:rPr>
+        <w:t xml:space="preserve">Modular project architecture </w:t>
+      </w:r>
+    </w:p>
+    <w:p>
+      <w:pPr>
+        <w:numPr>
+          <w:ilvl w:val="0"/>
+          <w:numId w:val="40"/>
+        </w:numPr>
+        <w:jc w:val="both"/>
+        <w:rPr>
+          <w:rFonts w:ascii="Times New Roman" w:hAnsi="Times New Roman" w:cs="Times New Roman"/>
+          <w:sz w:val="24"/>
+          <w:szCs w:val="24"/>
+        </w:rPr>
+      </w:pPr>
+      <w:r>
+        <w:rPr>
+          <w:rFonts w:ascii="Times New Roman" w:hAnsi="Times New Roman" w:cs="Times New Roman"/>
+          <w:sz w:val="24"/>
+          <w:szCs w:val="24"/>
+        </w:rPr>
+        <w:t xml:space="preserve">Real-time environmental data collection </w:t>
+      </w:r>
+    </w:p>
+    <w:p>
+      <w:pPr>
+        <w:numPr>
+          <w:ilvl w:val="0"/>
+          <w:numId w:val="40"/>
+        </w:numPr>
+        <w:jc w:val="both"/>
+        <w:rPr>
+          <w:rFonts w:ascii="Times New Roman" w:hAnsi="Times New Roman" w:cs="Times New Roman"/>
+          <w:sz w:val="24"/>
+          <w:szCs w:val="24"/>
+        </w:rPr>
+      </w:pPr>
+      <w:r>
+        <w:rPr>
+          <w:rFonts w:ascii="Times New Roman" w:hAnsi="Times New Roman" w:cs="Times New Roman"/>
+          <w:sz w:val="24"/>
+          <w:szCs w:val="24"/>
+        </w:rPr>
+        <w:t xml:space="preserve">MongoDB integration </w:t>
+      </w:r>
+    </w:p>
+    <w:p>
+      <w:pPr>
+        <w:numPr>
+          <w:ilvl w:val="0"/>
+          <w:numId w:val="40"/>
+        </w:numPr>
+        <w:jc w:val="both"/>
+        <w:rPr>
+          <w:rFonts w:ascii="Times New Roman" w:hAnsi="Times New Roman" w:cs="Times New Roman"/>
+          <w:sz w:val="24"/>
+          <w:szCs w:val="24"/>
+        </w:rPr>
+      </w:pPr>
+      <w:r>
+        <w:rPr>
+          <w:rFonts w:ascii="Times New Roman" w:hAnsi="Times New Roman" w:cs="Times New Roman"/>
+          <w:sz w:val="24"/>
+          <w:szCs w:val="24"/>
+        </w:rPr>
+        <w:t xml:space="preserve">Historical data management </w:t>
+      </w:r>
+    </w:p>
+    <w:p>
+      <w:pPr>
+        <w:numPr>
+          <w:ilvl w:val="0"/>
+          <w:numId w:val="40"/>
+        </w:numPr>
+        <w:jc w:val="both"/>
+        <w:rPr>
+          <w:rFonts w:ascii="Times New Roman" w:hAnsi="Times New Roman" w:cs="Times New Roman"/>
+          <w:sz w:val="24"/>
+          <w:szCs w:val="24"/>
+        </w:rPr>
+      </w:pPr>
+      <w:r>
+        <w:rPr>
+          <w:rFonts w:ascii="Times New Roman" w:hAnsi="Times New Roman" w:cs="Times New Roman"/>
+          <w:sz w:val="24"/>
+          <w:szCs w:val="24"/>
+        </w:rPr>
+        <w:t xml:space="preserve">Data validation and preprocessing </w:t>
+      </w:r>
+    </w:p>
+    <w:p>
+      <w:pPr>
+        <w:numPr>
+          <w:ilvl w:val="0"/>
+          <w:numId w:val="40"/>
+        </w:numPr>
+        <w:jc w:val="both"/>
+        <w:rPr>
+          <w:rFonts w:ascii="Times New Roman" w:hAnsi="Times New Roman" w:cs="Times New Roman"/>
+          <w:sz w:val="24"/>
+          <w:szCs w:val="24"/>
+        </w:rPr>
+      </w:pPr>
+      <w:r>
+        <w:rPr>
+          <w:rFonts w:ascii="Times New Roman" w:hAnsi="Times New Roman" w:cs="Times New Roman"/>
+          <w:sz w:val="24"/>
+          <w:szCs w:val="24"/>
+        </w:rPr>
+        <w:t xml:space="preserve">Repository pattern implementation </w:t>
+      </w:r>
+    </w:p>
+    <w:p>
+      <w:pPr>
+        <w:numPr>
+          <w:ilvl w:val="0"/>
+          <w:numId w:val="40"/>
+        </w:numPr>
+        <w:jc w:val="both"/>
+        <w:rPr>
+          <w:rFonts w:ascii="Times New Roman" w:hAnsi="Times New Roman" w:cs="Times New Roman"/>
+          <w:sz w:val="24"/>
+          <w:szCs w:val="24"/>
+        </w:rPr>
+      </w:pPr>
+      <w:r>
+        <w:rPr>
+          <w:rFonts w:ascii="Times New Roman" w:hAnsi="Times New Roman" w:cs="Times New Roman"/>
+          <w:sz w:val="24"/>
+          <w:szCs w:val="24"/>
+        </w:rPr>
+        <w:t xml:space="preserve">AI-ready backend design </w:t>
+      </w:r>
+    </w:p>
+    <w:p>
+      <w:pPr>
+        <w:jc w:val="both"/>
+        <w:rPr>
+          <w:rFonts w:ascii="Times New Roman" w:hAnsi="Times New Roman" w:cs="Times New Roman"/>
+          <w:b/>
+          <w:bCs/>
+          <w:sz w:val="28"/>
+          <w:szCs w:val="28"/>
+        </w:rPr>
+      </w:pPr>
+      <w:r>
+        <w:rPr>
+          <w:rFonts w:ascii="Times New Roman" w:hAnsi="Times New Roman" w:cs="Times New Roman"/>
+          <w:b/>
+          <w:bCs/>
+          <w:sz w:val="28"/>
+          <w:szCs w:val="28"/>
+        </w:rPr>
+        <w:t>FRONTEND</w:t>
+      </w:r>
+    </w:p>
+    <w:p>
+      <w:pPr>
+        <w:jc w:val="both"/>
+        <w:rPr>
+          <w:rFonts w:ascii="Times New Roman" w:hAnsi="Times New Roman" w:cs="Times New Roman"/>
+          <w:b/>
+          <w:bCs/>
+          <w:sz w:val="28"/>
+          <w:szCs w:val="28"/>
+        </w:rPr>
+      </w:pPr>
+      <w:r>
+        <w:rPr>
+          <w:rFonts w:ascii="Times New Roman" w:hAnsi="Times New Roman" w:cs="Times New Roman"/>
+          <w:b/>
+          <w:bCs/>
+          <w:sz w:val="28"/>
+          <w:szCs w:val="28"/>
+        </w:rPr>
+        <w:t>Frontend</w:t>
+      </w:r>
+    </w:p>
+    <w:p>
+      <w:pPr>
+        <w:jc w:val="both"/>
+        <w:rPr>
+          <w:rFonts w:ascii="Times New Roman" w:hAnsi="Times New Roman" w:cs="Times New Roman"/>
+          <w:sz w:val="24"/>
+          <w:szCs w:val="24"/>
+        </w:rPr>
+      </w:pPr>
+      <w:r>
+        <w:rPr>
+          <w:rFonts w:ascii="Times New Roman" w:hAnsi="Times New Roman" w:cs="Times New Roman"/>
+          <w:sz w:val="24"/>
+          <w:szCs w:val="24"/>
+        </w:rPr>
+        <w:t>The frontend of the Urban Air Quality Intelligence Platform is developed using React.js with Vite, providing a fast, responsive, and user-friendly web interface. It enables users to visualize environmental information through interactive dashboards and graphical representations.</w:t>
+      </w:r>
+    </w:p>
+    <w:p>
+      <w:pPr>
+        <w:jc w:val="both"/>
+        <w:rPr>
+          <w:rFonts w:ascii="Times New Roman" w:hAnsi="Times New Roman" w:cs="Times New Roman"/>
+          <w:sz w:val="24"/>
+          <w:szCs w:val="24"/>
+        </w:rPr>
+      </w:pPr>
+      <w:r>
+        <w:rPr>
+          <w:rFonts w:ascii="Times New Roman" w:hAnsi="Times New Roman" w:cs="Times New Roman"/>
+          <w:sz w:val="24"/>
+          <w:szCs w:val="24"/>
+        </w:rPr>
+        <w:t>The application follows a component-based architecture, where reusable components improve maintainability and simplify future development. The frontend communicates with the backend using REST APIs and dynamically updates environmental information without requiring page reloads.</w:t>
+      </w:r>
+    </w:p>
+    <w:p>
+      <w:pPr>
+        <w:jc w:val="both"/>
+        <w:rPr>
+          <w:rFonts w:ascii="Times New Roman" w:hAnsi="Times New Roman" w:cs="Times New Roman"/>
+          <w:sz w:val="24"/>
+          <w:szCs w:val="24"/>
+        </w:rPr>
+      </w:pPr>
+      <w:r>
+        <w:rPr>
+          <w:rFonts w:ascii="Times New Roman" w:hAnsi="Times New Roman" w:cs="Times New Roman"/>
+          <w:sz w:val="24"/>
+          <w:szCs w:val="24"/>
+        </w:rPr>
+        <w:t>The platform provides separate interfaces for Administrators and Citizens, ensuring role-based access to environmental information. The administrator dashboard offers advanced monitoring capabilities, while the citizen portal presents simplified environmental information for public awareness.</w:t>
+      </w:r>
+    </w:p>
+    <w:p>
+      <w:pPr>
+        <w:jc w:val="both"/>
+        <w:rPr>
+          <w:rFonts w:ascii="Times New Roman" w:hAnsi="Times New Roman" w:cs="Times New Roman"/>
+          <w:sz w:val="24"/>
+          <w:szCs w:val="24"/>
+        </w:rPr>
+      </w:pPr>
+      <w:r>
+        <w:rPr>
+          <w:rFonts w:ascii="Times New Roman" w:hAnsi="Times New Roman" w:cs="Times New Roman"/>
+          <w:sz w:val="24"/>
+          <w:szCs w:val="24"/>
+        </w:rPr>
+        <w:t>Interactive visualizations include AQI indicators, pollutant concentration cards, weather summaries, hourly forecasts, GIS-based environmental maps, and AI diagnostics interfaces. The responsive design ensures compatibility across desktop and mobile devices.</w:t>
+      </w:r>
+    </w:p>
+    <w:p>
+      <w:pPr>
+        <w:jc w:val="both"/>
+        <w:rPr>
+          <w:rFonts w:ascii="Times New Roman" w:hAnsi="Times New Roman" w:cs="Times New Roman"/>
+          <w:sz w:val="24"/>
+          <w:szCs w:val="24"/>
+        </w:rPr>
+      </w:pPr>
+      <w:r>
+        <w:rPr>
+          <w:rFonts w:ascii="Times New Roman" w:hAnsi="Times New Roman" w:cs="Times New Roman"/>
+          <w:sz w:val="24"/>
+          <w:szCs w:val="24"/>
+        </w:rPr>
+        <w:t>Key Features</w:t>
+      </w:r>
+    </w:p>
+    <w:p>
+      <w:pPr>
+        <w:numPr>
+          <w:ilvl w:val="0"/>
+          <w:numId w:val="41"/>
+        </w:numPr>
+        <w:jc w:val="both"/>
+        <w:rPr>
+          <w:rFonts w:ascii="Times New Roman" w:hAnsi="Times New Roman" w:cs="Times New Roman"/>
+          <w:sz w:val="24"/>
+          <w:szCs w:val="24"/>
+        </w:rPr>
+      </w:pPr>
+      <w:r>
+        <w:rPr>
+          <w:rFonts w:ascii="Times New Roman" w:hAnsi="Times New Roman" w:cs="Times New Roman"/>
+          <w:sz w:val="24"/>
+          <w:szCs w:val="24"/>
+        </w:rPr>
+        <w:t xml:space="preserve">React-based component architecture </w:t>
+      </w:r>
+    </w:p>
+    <w:p>
+      <w:pPr>
+        <w:numPr>
+          <w:ilvl w:val="0"/>
+          <w:numId w:val="41"/>
+        </w:numPr>
+        <w:jc w:val="both"/>
+        <w:rPr>
+          <w:rFonts w:ascii="Times New Roman" w:hAnsi="Times New Roman" w:cs="Times New Roman"/>
+          <w:sz w:val="24"/>
+          <w:szCs w:val="24"/>
+        </w:rPr>
+      </w:pPr>
+      <w:r>
+        <w:rPr>
+          <w:rFonts w:ascii="Times New Roman" w:hAnsi="Times New Roman" w:cs="Times New Roman"/>
+          <w:sz w:val="24"/>
+          <w:szCs w:val="24"/>
+        </w:rPr>
+        <w:t xml:space="preserve">Responsive user interface </w:t>
+      </w:r>
+    </w:p>
+    <w:p>
+      <w:pPr>
+        <w:numPr>
+          <w:ilvl w:val="0"/>
+          <w:numId w:val="41"/>
+        </w:numPr>
+        <w:jc w:val="both"/>
+        <w:rPr>
+          <w:rFonts w:ascii="Times New Roman" w:hAnsi="Times New Roman" w:cs="Times New Roman"/>
+          <w:sz w:val="24"/>
+          <w:szCs w:val="24"/>
+        </w:rPr>
+      </w:pPr>
+      <w:r>
+        <w:rPr>
+          <w:rFonts w:ascii="Times New Roman" w:hAnsi="Times New Roman" w:cs="Times New Roman"/>
+          <w:sz w:val="24"/>
+          <w:szCs w:val="24"/>
+        </w:rPr>
+        <w:t xml:space="preserve">Administrator portal </w:t>
+      </w:r>
+    </w:p>
+    <w:p>
+      <w:pPr>
+        <w:numPr>
+          <w:ilvl w:val="0"/>
+          <w:numId w:val="41"/>
+        </w:numPr>
+        <w:jc w:val="both"/>
+        <w:rPr>
+          <w:rFonts w:ascii="Times New Roman" w:hAnsi="Times New Roman" w:cs="Times New Roman"/>
+          <w:sz w:val="24"/>
+          <w:szCs w:val="24"/>
+        </w:rPr>
+      </w:pPr>
+      <w:r>
+        <w:rPr>
+          <w:rFonts w:ascii="Times New Roman" w:hAnsi="Times New Roman" w:cs="Times New Roman"/>
+          <w:sz w:val="24"/>
+          <w:szCs w:val="24"/>
+        </w:rPr>
+        <w:t xml:space="preserve">Citizen portal </w:t>
+      </w:r>
+    </w:p>
+    <w:p>
+      <w:pPr>
+        <w:numPr>
+          <w:ilvl w:val="0"/>
+          <w:numId w:val="41"/>
+        </w:numPr>
+        <w:jc w:val="both"/>
+        <w:rPr>
+          <w:rFonts w:ascii="Times New Roman" w:hAnsi="Times New Roman" w:cs="Times New Roman"/>
+          <w:sz w:val="24"/>
+          <w:szCs w:val="24"/>
+        </w:rPr>
+      </w:pPr>
+      <w:r>
+        <w:rPr>
+          <w:rFonts w:ascii="Times New Roman" w:hAnsi="Times New Roman" w:cs="Times New Roman"/>
+          <w:sz w:val="24"/>
+          <w:szCs w:val="24"/>
+        </w:rPr>
+        <w:lastRenderedPageBreak/>
+        <w:t xml:space="preserve">Secure login interface </w:t>
+      </w:r>
+    </w:p>
+    <w:p>
+      <w:pPr>
+        <w:numPr>
+          <w:ilvl w:val="0"/>
+          <w:numId w:val="41"/>
+        </w:numPr>
+        <w:jc w:val="both"/>
+        <w:rPr>
+          <w:rFonts w:ascii="Times New Roman" w:hAnsi="Times New Roman" w:cs="Times New Roman"/>
+          <w:sz w:val="24"/>
+          <w:szCs w:val="24"/>
+        </w:rPr>
+      </w:pPr>
+      <w:r>
+        <w:rPr>
+          <w:rFonts w:ascii="Times New Roman" w:hAnsi="Times New Roman" w:cs="Times New Roman"/>
+          <w:sz w:val="24"/>
+          <w:szCs w:val="24"/>
+        </w:rPr>
+        <w:t xml:space="preserve">Interactive dashboards </w:t>
+      </w:r>
+    </w:p>
+    <w:p>
+      <w:pPr>
+        <w:numPr>
+          <w:ilvl w:val="0"/>
+          <w:numId w:val="41"/>
+        </w:numPr>
+        <w:jc w:val="both"/>
+        <w:rPr>
+          <w:rFonts w:ascii="Times New Roman" w:hAnsi="Times New Roman" w:cs="Times New Roman"/>
+          <w:sz w:val="24"/>
+          <w:szCs w:val="24"/>
+        </w:rPr>
+      </w:pPr>
+      <w:r>
+        <w:rPr>
+          <w:rFonts w:ascii="Times New Roman" w:hAnsi="Times New Roman" w:cs="Times New Roman"/>
+          <w:sz w:val="24"/>
+          <w:szCs w:val="24"/>
+        </w:rPr>
+        <w:t xml:space="preserve">GIS visualization </w:t>
+      </w:r>
+    </w:p>
+    <w:p>
+      <w:pPr>
+        <w:numPr>
+          <w:ilvl w:val="0"/>
+          <w:numId w:val="41"/>
+        </w:numPr>
+        <w:jc w:val="both"/>
+        <w:rPr>
+          <w:rFonts w:ascii="Times New Roman" w:hAnsi="Times New Roman" w:cs="Times New Roman"/>
+          <w:sz w:val="24"/>
+          <w:szCs w:val="24"/>
+        </w:rPr>
+      </w:pPr>
+      <w:r>
+        <w:rPr>
+          <w:rFonts w:ascii="Times New Roman" w:hAnsi="Times New Roman" w:cs="Times New Roman"/>
+          <w:sz w:val="24"/>
+          <w:szCs w:val="24"/>
+        </w:rPr>
+        <w:t xml:space="preserve">AQI monitoring </w:t>
+      </w:r>
+    </w:p>
+    <w:p>
+      <w:pPr>
+        <w:numPr>
+          <w:ilvl w:val="0"/>
+          <w:numId w:val="41"/>
+        </w:numPr>
+        <w:jc w:val="both"/>
+        <w:rPr>
+          <w:rFonts w:ascii="Times New Roman" w:hAnsi="Times New Roman" w:cs="Times New Roman"/>
+          <w:sz w:val="24"/>
+          <w:szCs w:val="24"/>
+        </w:rPr>
+      </w:pPr>
+      <w:r>
+        <w:rPr>
+          <w:rFonts w:ascii="Times New Roman" w:hAnsi="Times New Roman" w:cs="Times New Roman"/>
+          <w:sz w:val="24"/>
+          <w:szCs w:val="24"/>
+        </w:rPr>
+        <w:t xml:space="preserve">Weather monitoring </w:t>
+      </w:r>
+    </w:p>
+    <w:p>
+      <w:pPr>
+        <w:numPr>
+          <w:ilvl w:val="0"/>
+          <w:numId w:val="41"/>
+        </w:numPr>
+        <w:jc w:val="both"/>
+        <w:rPr>
+          <w:rFonts w:ascii="Times New Roman" w:hAnsi="Times New Roman" w:cs="Times New Roman"/>
+          <w:sz w:val="24"/>
+          <w:szCs w:val="24"/>
+        </w:rPr>
+      </w:pPr>
+      <w:r>
+        <w:rPr>
+          <w:rFonts w:ascii="Times New Roman" w:hAnsi="Times New Roman" w:cs="Times New Roman"/>
+          <w:sz w:val="24"/>
+          <w:szCs w:val="24"/>
+        </w:rPr>
+        <w:t xml:space="preserve">Pollutant visualization </w:t>
+      </w:r>
+    </w:p>
+    <w:p>
+      <w:pPr>
+        <w:numPr>
+          <w:ilvl w:val="0"/>
+          <w:numId w:val="41"/>
+        </w:numPr>
+        <w:jc w:val="both"/>
+        <w:rPr>
+          <w:rFonts w:ascii="Times New Roman" w:hAnsi="Times New Roman" w:cs="Times New Roman"/>
+          <w:sz w:val="24"/>
+          <w:szCs w:val="24"/>
+        </w:rPr>
+      </w:pPr>
+      <w:r>
+        <w:rPr>
+          <w:rFonts w:ascii="Times New Roman" w:hAnsi="Times New Roman" w:cs="Times New Roman"/>
+          <w:sz w:val="24"/>
+          <w:szCs w:val="24"/>
+        </w:rPr>
+        <w:t xml:space="preserve">AI diagnostics interface </w:t>
+      </w:r>
+    </w:p>
+    <w:p>
+      <w:pPr>
+        <w:numPr>
+          <w:ilvl w:val="0"/>
+          <w:numId w:val="41"/>
+        </w:numPr>
+        <w:jc w:val="both"/>
+        <w:rPr>
+          <w:rFonts w:ascii="Times New Roman" w:hAnsi="Times New Roman" w:cs="Times New Roman"/>
+          <w:b/>
+          <w:bCs/>
+          <w:sz w:val="24"/>
+          <w:szCs w:val="24"/>
+        </w:rPr>
+      </w:pPr>
+      <w:r>
+        <w:rPr>
+          <w:rFonts w:ascii="Times New Roman" w:hAnsi="Times New Roman" w:cs="Times New Roman"/>
+          <w:sz w:val="24"/>
+          <w:szCs w:val="24"/>
+        </w:rPr>
+        <w:t>Source attribution dashboard</w:t>
+      </w:r>
+      <w:r>
+        <w:rPr>
+          <w:rFonts w:ascii="Times New Roman" w:hAnsi="Times New Roman" w:cs="Times New Roman"/>
+          <w:b/>
+          <w:bCs/>
+          <w:sz w:val="24"/>
+          <w:szCs w:val="24"/>
+        </w:rPr>
+        <w:t xml:space="preserve"> </w:t>
+      </w:r>
+    </w:p>
+    <w:p>
+      <w:pPr>
+        <w:jc w:val="both"/>
+        <w:rPr>
+          <w:rFonts w:ascii="Times New Roman" w:hAnsi="Times New Roman" w:cs="Times New Roman"/>
+          <w:b/>
+          <w:bCs/>
+          <w:sz w:val="28"/>
+          <w:szCs w:val="28"/>
+        </w:rPr>
+      </w:pPr>
+    </w:p>
+    <w:p>
+      <w:pPr>
+        <w:jc w:val="both"/>
+        <w:rPr>
+          <w:rFonts w:ascii="Times New Roman" w:hAnsi="Times New Roman" w:cs="Times New Roman"/>
+          <w:b/>
+          <w:bCs/>
+          <w:sz w:val="28"/>
+          <w:szCs w:val="28"/>
+        </w:rPr>
+      </w:pPr>
+      <w:r>
+        <w:rPr>
+          <w:rFonts w:ascii="Times New Roman" w:hAnsi="Times New Roman" w:cs="Times New Roman"/>
+          <w:b/>
+          <w:bCs/>
+          <w:sz w:val="28"/>
+          <w:szCs w:val="28"/>
+        </w:rPr>
+        <w:t>Database</w:t>
+      </w:r>
+    </w:p>
+    <w:p>
+      <w:pPr>
+        <w:jc w:val="both"/>
+        <w:rPr>
+          <w:rFonts w:ascii="Times New Roman" w:hAnsi="Times New Roman" w:cs="Times New Roman"/>
+          <w:sz w:val="24"/>
+          <w:szCs w:val="24"/>
+        </w:rPr>
+      </w:pPr>
+      <w:r>
+        <w:rPr>
+          <w:rFonts w:ascii="Times New Roman" w:hAnsi="Times New Roman" w:cs="Times New Roman"/>
+          <w:sz w:val="24"/>
+          <w:szCs w:val="24"/>
+        </w:rPr>
+        <w:t>MongoDB is used as the primary NoSQL database for storing environmental information collected from external APIs. It stores both current and historical records, enabling long-term analysis and visualization of environmental trends.</w:t>
+      </w:r>
+    </w:p>
+    <w:p>
+      <w:pPr>
+        <w:jc w:val="both"/>
+        <w:rPr>
+          <w:rFonts w:ascii="Times New Roman" w:hAnsi="Times New Roman" w:cs="Times New Roman"/>
+          <w:sz w:val="24"/>
+          <w:szCs w:val="24"/>
+        </w:rPr>
+      </w:pPr>
+      <w:r>
+        <w:rPr>
+          <w:rFonts w:ascii="Times New Roman" w:hAnsi="Times New Roman" w:cs="Times New Roman"/>
+          <w:sz w:val="24"/>
+          <w:szCs w:val="24"/>
+        </w:rPr>
+        <w:t>Separate collections are maintained for AQI data, weather information, traffic information, and integrated environmental datasets. MongoDB's document-oriented architecture provides flexibility in handling diverse environmental data structures while ensuring efficient retrieval and scalability.</w:t>
+      </w:r>
+    </w:p>
+    <w:p>
+      <w:pPr>
+        <w:jc w:val="both"/>
+        <w:rPr>
+          <w:rFonts w:ascii="Times New Roman" w:hAnsi="Times New Roman" w:cs="Times New Roman"/>
+          <w:sz w:val="24"/>
+          <w:szCs w:val="24"/>
+        </w:rPr>
+      </w:pPr>
+      <w:r>
+        <w:rPr>
+          <w:rFonts w:ascii="Times New Roman" w:hAnsi="Times New Roman" w:cs="Times New Roman"/>
+          <w:sz w:val="24"/>
+          <w:szCs w:val="24"/>
+        </w:rPr>
+        <w:t>Stored Information</w:t>
+      </w:r>
+    </w:p>
+    <w:p>
+      <w:pPr>
+        <w:numPr>
+          <w:ilvl w:val="0"/>
+          <w:numId w:val="42"/>
+        </w:numPr>
+        <w:jc w:val="both"/>
+        <w:rPr>
+          <w:rFonts w:ascii="Times New Roman" w:hAnsi="Times New Roman" w:cs="Times New Roman"/>
+          <w:sz w:val="24"/>
+          <w:szCs w:val="24"/>
+        </w:rPr>
+      </w:pPr>
+      <w:r>
+        <w:rPr>
+          <w:rFonts w:ascii="Times New Roman" w:hAnsi="Times New Roman" w:cs="Times New Roman"/>
+          <w:sz w:val="24"/>
+          <w:szCs w:val="24"/>
+        </w:rPr>
+        <w:t xml:space="preserve">Air Quality Index (AQI) </w:t>
+      </w:r>
+    </w:p>
+    <w:p>
+      <w:pPr>
+        <w:numPr>
+          <w:ilvl w:val="0"/>
+          <w:numId w:val="42"/>
+        </w:numPr>
+        <w:jc w:val="both"/>
+        <w:rPr>
+          <w:rFonts w:ascii="Times New Roman" w:hAnsi="Times New Roman" w:cs="Times New Roman"/>
+          <w:sz w:val="24"/>
+          <w:szCs w:val="24"/>
+        </w:rPr>
+      </w:pPr>
+      <w:r>
+        <w:rPr>
+          <w:rFonts w:ascii="Times New Roman" w:hAnsi="Times New Roman" w:cs="Times New Roman"/>
+          <w:sz w:val="24"/>
+          <w:szCs w:val="24"/>
+        </w:rPr>
+        <w:t xml:space="preserve">PM2.5 </w:t>
+      </w:r>
+    </w:p>
+    <w:p>
+      <w:pPr>
+        <w:numPr>
+          <w:ilvl w:val="0"/>
+          <w:numId w:val="42"/>
+        </w:numPr>
+        <w:jc w:val="both"/>
+        <w:rPr>
+          <w:rFonts w:ascii="Times New Roman" w:hAnsi="Times New Roman" w:cs="Times New Roman"/>
+          <w:sz w:val="24"/>
+          <w:szCs w:val="24"/>
+        </w:rPr>
+      </w:pPr>
+      <w:r>
+        <w:rPr>
+          <w:rFonts w:ascii="Times New Roman" w:hAnsi="Times New Roman" w:cs="Times New Roman"/>
+          <w:sz w:val="24"/>
+          <w:szCs w:val="24"/>
+        </w:rPr>
+        <w:t xml:space="preserve">PM10 </w:t>
+      </w:r>
+    </w:p>
+    <w:p>
+      <w:pPr>
+        <w:numPr>
+          <w:ilvl w:val="0"/>
+          <w:numId w:val="42"/>
+        </w:numPr>
+        <w:jc w:val="both"/>
+        <w:rPr>
+          <w:rFonts w:ascii="Times New Roman" w:hAnsi="Times New Roman" w:cs="Times New Roman"/>
+          <w:sz w:val="24"/>
+          <w:szCs w:val="24"/>
+        </w:rPr>
+      </w:pPr>
+      <w:r>
+        <w:rPr>
+          <w:rFonts w:ascii="Times New Roman" w:hAnsi="Times New Roman" w:cs="Times New Roman"/>
+          <w:sz w:val="24"/>
+          <w:szCs w:val="24"/>
+        </w:rPr>
+        <w:t xml:space="preserve">NO₂ </w:t>
+      </w:r>
+    </w:p>
+    <w:p>
+      <w:pPr>
+        <w:numPr>
+          <w:ilvl w:val="0"/>
+          <w:numId w:val="42"/>
+        </w:numPr>
+        <w:jc w:val="both"/>
+        <w:rPr>
+          <w:rFonts w:ascii="Times New Roman" w:hAnsi="Times New Roman" w:cs="Times New Roman"/>
+          <w:sz w:val="24"/>
+          <w:szCs w:val="24"/>
+        </w:rPr>
+      </w:pPr>
+      <w:r>
+        <w:rPr>
+          <w:rFonts w:ascii="Times New Roman" w:hAnsi="Times New Roman" w:cs="Times New Roman"/>
+          <w:sz w:val="24"/>
+          <w:szCs w:val="24"/>
+        </w:rPr>
+        <w:t xml:space="preserve">SO₂ </w:t>
+      </w:r>
+    </w:p>
+    <w:p>
+      <w:pPr>
+        <w:numPr>
+          <w:ilvl w:val="0"/>
+          <w:numId w:val="42"/>
+        </w:numPr>
+        <w:jc w:val="both"/>
+        <w:rPr>
+          <w:rFonts w:ascii="Times New Roman" w:hAnsi="Times New Roman" w:cs="Times New Roman"/>
+          <w:sz w:val="24"/>
+          <w:szCs w:val="24"/>
+        </w:rPr>
+      </w:pPr>
+      <w:r>
+        <w:rPr>
+          <w:rFonts w:ascii="Times New Roman" w:hAnsi="Times New Roman" w:cs="Times New Roman"/>
+          <w:sz w:val="24"/>
+          <w:szCs w:val="24"/>
+        </w:rPr>
+        <w:t xml:space="preserve">CO </w:t>
+      </w:r>
+    </w:p>
+    <w:p>
+      <w:pPr>
+        <w:numPr>
+          <w:ilvl w:val="0"/>
+          <w:numId w:val="42"/>
+        </w:numPr>
+        <w:jc w:val="both"/>
+        <w:rPr>
+          <w:rFonts w:ascii="Times New Roman" w:hAnsi="Times New Roman" w:cs="Times New Roman"/>
+          <w:sz w:val="24"/>
+          <w:szCs w:val="24"/>
+        </w:rPr>
+      </w:pPr>
+      <w:r>
+        <w:rPr>
+          <w:rFonts w:ascii="Times New Roman" w:hAnsi="Times New Roman" w:cs="Times New Roman"/>
+          <w:sz w:val="24"/>
+          <w:szCs w:val="24"/>
+        </w:rPr>
+        <w:t xml:space="preserve">Temperature </w:t>
+      </w:r>
+    </w:p>
+    <w:p>
+      <w:pPr>
+        <w:numPr>
+          <w:ilvl w:val="0"/>
+          <w:numId w:val="42"/>
+        </w:numPr>
+        <w:jc w:val="both"/>
+        <w:rPr>
+          <w:rFonts w:ascii="Times New Roman" w:hAnsi="Times New Roman" w:cs="Times New Roman"/>
+          <w:sz w:val="24"/>
+          <w:szCs w:val="24"/>
+        </w:rPr>
+      </w:pPr>
+      <w:r>
+        <w:rPr>
+          <w:rFonts w:ascii="Times New Roman" w:hAnsi="Times New Roman" w:cs="Times New Roman"/>
+          <w:sz w:val="24"/>
+          <w:szCs w:val="24"/>
+        </w:rPr>
+        <w:t xml:space="preserve">Humidity </w:t>
+      </w:r>
+    </w:p>
+    <w:p>
+      <w:pPr>
+        <w:numPr>
+          <w:ilvl w:val="0"/>
+          <w:numId w:val="42"/>
+        </w:numPr>
+        <w:jc w:val="both"/>
+        <w:rPr>
+          <w:rFonts w:ascii="Times New Roman" w:hAnsi="Times New Roman" w:cs="Times New Roman"/>
+          <w:sz w:val="24"/>
+          <w:szCs w:val="24"/>
+        </w:rPr>
+      </w:pPr>
+      <w:r>
+        <w:rPr>
+          <w:rFonts w:ascii="Times New Roman" w:hAnsi="Times New Roman" w:cs="Times New Roman"/>
+          <w:sz w:val="24"/>
+          <w:szCs w:val="24"/>
+        </w:rPr>
+        <w:t xml:space="preserve">Wind Speed </w:t>
+      </w:r>
+    </w:p>
+    <w:p>
+      <w:pPr>
+        <w:numPr>
+          <w:ilvl w:val="0"/>
+          <w:numId w:val="42"/>
+        </w:numPr>
+        <w:jc w:val="both"/>
+        <w:rPr>
+          <w:rFonts w:ascii="Times New Roman" w:hAnsi="Times New Roman" w:cs="Times New Roman"/>
+          <w:sz w:val="24"/>
+          <w:szCs w:val="24"/>
+        </w:rPr>
+      </w:pPr>
+      <w:r>
+        <w:rPr>
+          <w:rFonts w:ascii="Times New Roman" w:hAnsi="Times New Roman" w:cs="Times New Roman"/>
+          <w:sz w:val="24"/>
+          <w:szCs w:val="24"/>
+        </w:rPr>
+        <w:t xml:space="preserve">UV Index </w:t>
+      </w:r>
+    </w:p>
+    <w:p>
+      <w:pPr>
+        <w:numPr>
+          <w:ilvl w:val="0"/>
+          <w:numId w:val="42"/>
+        </w:numPr>
+        <w:jc w:val="both"/>
+        <w:rPr>
+          <w:rFonts w:ascii="Times New Roman" w:hAnsi="Times New Roman" w:cs="Times New Roman"/>
+          <w:sz w:val="24"/>
+          <w:szCs w:val="24"/>
+        </w:rPr>
+      </w:pPr>
+      <w:r>
+        <w:rPr>
+          <w:rFonts w:ascii="Times New Roman" w:hAnsi="Times New Roman" w:cs="Times New Roman"/>
+          <w:sz w:val="24"/>
+          <w:szCs w:val="24"/>
+        </w:rPr>
+        <w:t xml:space="preserve">Traffic Conditions </w:t>
+      </w:r>
+    </w:p>
+    <w:p>
+      <w:pPr>
+        <w:numPr>
+          <w:ilvl w:val="0"/>
+          <w:numId w:val="42"/>
+        </w:numPr>
+        <w:jc w:val="both"/>
+        <w:rPr>
+          <w:rFonts w:ascii="Times New Roman" w:hAnsi="Times New Roman" w:cs="Times New Roman"/>
+          <w:sz w:val="24"/>
+          <w:szCs w:val="24"/>
+        </w:rPr>
+      </w:pPr>
+      <w:r>
+        <w:rPr>
+          <w:rFonts w:ascii="Times New Roman" w:hAnsi="Times New Roman" w:cs="Times New Roman"/>
+          <w:sz w:val="24"/>
+          <w:szCs w:val="24"/>
+        </w:rPr>
+        <w:t xml:space="preserve">Historical Environmental Data </w:t>
+      </w:r>
+    </w:p>
+    <w:p>
+      <w:pPr>
+        <w:jc w:val="both"/>
+        <w:rPr>
+          <w:rFonts w:ascii="Times New Roman" w:hAnsi="Times New Roman" w:cs="Times New Roman"/>
+          <w:b/>
+          <w:bCs/>
+          <w:sz w:val="28"/>
+          <w:szCs w:val="28"/>
+        </w:rPr>
+      </w:pPr>
+    </w:p>
+    <w:p>
+      <w:pPr>
+        <w:jc w:val="both"/>
+        <w:rPr>
+          <w:rFonts w:ascii="Times New Roman" w:hAnsi="Times New Roman" w:cs="Times New Roman"/>
+          <w:b/>
+          <w:bCs/>
+          <w:sz w:val="28"/>
+          <w:szCs w:val="28"/>
+        </w:rPr>
+      </w:pPr>
+    </w:p>
+    <w:p>
+      <w:pPr>
+        <w:jc w:val="both"/>
+        <w:rPr>
+          <w:rFonts w:ascii="Times New Roman" w:hAnsi="Times New Roman" w:cs="Times New Roman"/>
+          <w:b/>
+          <w:bCs/>
+          <w:sz w:val="28"/>
+          <w:szCs w:val="28"/>
+        </w:rPr>
+      </w:pPr>
+      <w:r>
+        <w:rPr>
+          <w:rFonts w:ascii="Times New Roman" w:hAnsi="Times New Roman" w:cs="Times New Roman"/>
+          <w:b/>
+          <w:bCs/>
+          <w:sz w:val="28"/>
+          <w:szCs w:val="28"/>
+        </w:rPr>
+        <w:lastRenderedPageBreak/>
+        <w:t>External APIs</w:t>
+      </w:r>
+    </w:p>
+    <w:p>
+      <w:pPr>
+        <w:jc w:val="both"/>
+        <w:rPr>
+          <w:rFonts w:ascii="Times New Roman" w:hAnsi="Times New Roman" w:cs="Times New Roman"/>
+          <w:sz w:val="24"/>
+          <w:szCs w:val="24"/>
+        </w:rPr>
+      </w:pPr>
+      <w:r>
+        <w:rPr>
+          <w:rFonts w:ascii="Times New Roman" w:hAnsi="Times New Roman" w:cs="Times New Roman"/>
+          <w:sz w:val="24"/>
+          <w:szCs w:val="24"/>
+        </w:rPr>
+        <w:t>The platform integrates multiple external APIs to obtain real-time environmental information from reliable sources.</w:t>
+      </w:r>
+    </w:p>
+    <w:p>
+      <w:pPr>
+        <w:jc w:val="both"/>
+        <w:rPr>
+          <w:rFonts w:ascii="Times New Roman" w:hAnsi="Times New Roman" w:cs="Times New Roman"/>
+          <w:sz w:val="24"/>
+          <w:szCs w:val="24"/>
+        </w:rPr>
+      </w:pPr>
+      <w:r>
+        <w:rPr>
+          <w:rFonts w:ascii="Times New Roman" w:hAnsi="Times New Roman" w:cs="Times New Roman"/>
+          <w:sz w:val="24"/>
+          <w:szCs w:val="24"/>
+        </w:rPr>
+        <w:t>OpenWeather Air Pollution API</w:t>
+      </w:r>
+    </w:p>
+    <w:p>
+      <w:pPr>
+        <w:jc w:val="both"/>
+        <w:rPr>
+          <w:rFonts w:ascii="Times New Roman" w:hAnsi="Times New Roman" w:cs="Times New Roman"/>
+          <w:sz w:val="24"/>
+          <w:szCs w:val="24"/>
+        </w:rPr>
+      </w:pPr>
+      <w:r>
+        <w:rPr>
+          <w:rFonts w:ascii="Times New Roman" w:hAnsi="Times New Roman" w:cs="Times New Roman"/>
+          <w:sz w:val="24"/>
+          <w:szCs w:val="24"/>
+        </w:rPr>
+        <w:t>Provides Air Quality Index (AQI) values and pollutant concentrations, including PM2.5, PM10, NO₂, SO₂, and CO.</w:t>
+      </w:r>
+    </w:p>
+    <w:p>
+      <w:pPr>
+        <w:jc w:val="both"/>
+        <w:rPr>
+          <w:rFonts w:ascii="Times New Roman" w:hAnsi="Times New Roman" w:cs="Times New Roman"/>
+          <w:sz w:val="24"/>
+          <w:szCs w:val="24"/>
+        </w:rPr>
+      </w:pPr>
+      <w:r>
+        <w:rPr>
+          <w:rFonts w:ascii="Times New Roman" w:hAnsi="Times New Roman" w:cs="Times New Roman"/>
+          <w:sz w:val="24"/>
+          <w:szCs w:val="24"/>
+        </w:rPr>
+        <w:t>OpenWeather Weather API</w:t>
+      </w:r>
+    </w:p>
+    <w:p>
+      <w:pPr>
+        <w:jc w:val="both"/>
+        <w:rPr>
+          <w:rFonts w:ascii="Times New Roman" w:hAnsi="Times New Roman" w:cs="Times New Roman"/>
+          <w:sz w:val="24"/>
+          <w:szCs w:val="24"/>
+        </w:rPr>
+      </w:pPr>
+      <w:r>
+        <w:rPr>
+          <w:rFonts w:ascii="Times New Roman" w:hAnsi="Times New Roman" w:cs="Times New Roman"/>
+          <w:sz w:val="24"/>
+          <w:szCs w:val="24"/>
+        </w:rPr>
+        <w:t>Provides meteorological parameters such as temperature, humidity, wind speed, and UV index.</w:t>
+      </w:r>
+    </w:p>
+    <w:p>
+      <w:pPr>
+        <w:jc w:val="both"/>
+        <w:rPr>
+          <w:rFonts w:ascii="Times New Roman" w:hAnsi="Times New Roman" w:cs="Times New Roman"/>
+          <w:sz w:val="24"/>
+          <w:szCs w:val="24"/>
+        </w:rPr>
+      </w:pPr>
+      <w:r>
+        <w:rPr>
+          <w:rFonts w:ascii="Times New Roman" w:hAnsi="Times New Roman" w:cs="Times New Roman"/>
+          <w:sz w:val="24"/>
+          <w:szCs w:val="24"/>
+        </w:rPr>
+        <w:t>TomTom Traffic API</w:t>
+      </w:r>
+    </w:p>
+    <w:p>
+      <w:pPr>
+        <w:jc w:val="both"/>
+        <w:rPr>
+          <w:rFonts w:ascii="Times New Roman" w:hAnsi="Times New Roman" w:cs="Times New Roman"/>
+          <w:sz w:val="24"/>
+          <w:szCs w:val="24"/>
+        </w:rPr>
+      </w:pPr>
+      <w:r>
+        <w:rPr>
+          <w:rFonts w:ascii="Times New Roman" w:hAnsi="Times New Roman" w:cs="Times New Roman"/>
+          <w:sz w:val="24"/>
+          <w:szCs w:val="24"/>
+        </w:rPr>
+        <w:t>Provides real-time traffic flow and congestion information, enabling environmental analysis based on traffic conditions.</w:t>
+      </w:r>
+    </w:p>
+    <w:p>
+      <w:pPr>
+        <w:jc w:val="both"/>
+        <w:rPr>
+          <w:rFonts w:ascii="Times New Roman" w:hAnsi="Times New Roman" w:cs="Times New Roman"/>
+          <w:sz w:val="24"/>
+          <w:szCs w:val="24"/>
+        </w:rPr>
+      </w:pPr>
+      <w:r>
+        <w:rPr>
+          <w:rFonts w:ascii="Times New Roman" w:hAnsi="Times New Roman" w:cs="Times New Roman"/>
+          <w:sz w:val="24"/>
+          <w:szCs w:val="24"/>
+        </w:rPr>
+        <w:t>The collected information is integrated through the backend to provide a unified environmental monitoring platform.</w:t>
+      </w:r>
+    </w:p>
+    <w:p>
+      <w:pPr>
+        <w:jc w:val="both"/>
+        <w:rPr>
+          <w:rFonts w:ascii="Times New Roman" w:hAnsi="Times New Roman" w:cs="Times New Roman"/>
+          <w:b/>
+          <w:bCs/>
+          <w:sz w:val="28"/>
+          <w:szCs w:val="28"/>
+        </w:rPr>
+      </w:pPr>
+    </w:p>
+    <w:p>
+      <w:pPr>
+        <w:jc w:val="both"/>
+        <w:rPr>
+          <w:rFonts w:ascii="Times New Roman" w:hAnsi="Times New Roman" w:cs="Times New Roman"/>
+          <w:b/>
+          <w:bCs/>
+          <w:sz w:val="28"/>
+          <w:szCs w:val="28"/>
+        </w:rPr>
+      </w:pPr>
+      <w:r>
+        <w:rPr>
+          <w:rFonts w:ascii="Times New Roman" w:hAnsi="Times New Roman" w:cs="Times New Roman"/>
+          <w:b/>
+          <w:bCs/>
+          <w:sz w:val="28"/>
+          <w:szCs w:val="28"/>
+        </w:rPr>
+        <w:t>Portal Overview</w:t>
+      </w:r>
+    </w:p>
+    <w:p>
+      <w:pPr>
+        <w:jc w:val="both"/>
+        <w:rPr>
+          <w:rFonts w:ascii="Times New Roman" w:hAnsi="Times New Roman" w:cs="Times New Roman"/>
+          <w:sz w:val="24"/>
+          <w:szCs w:val="24"/>
+        </w:rPr>
+      </w:pPr>
+      <w:r>
+        <w:rPr>
+          <w:rFonts w:ascii="Times New Roman" w:hAnsi="Times New Roman" w:cs="Times New Roman"/>
+          <w:sz w:val="24"/>
+          <w:szCs w:val="24"/>
+        </w:rPr>
+        <w:t>The Urban Air Quality Intelligence Platform provides a web-based portal for monitoring environmental conditions and supporting data-driven decision-making.</w:t>
+      </w:r>
+    </w:p>
+    <w:p>
+      <w:pPr>
+        <w:jc w:val="both"/>
+        <w:rPr>
+          <w:rFonts w:ascii="Times New Roman" w:hAnsi="Times New Roman" w:cs="Times New Roman"/>
+          <w:sz w:val="24"/>
+          <w:szCs w:val="24"/>
+        </w:rPr>
+      </w:pPr>
+      <w:r>
+        <w:rPr>
+          <w:rFonts w:ascii="Times New Roman" w:hAnsi="Times New Roman" w:cs="Times New Roman"/>
+          <w:sz w:val="24"/>
+          <w:szCs w:val="24"/>
+        </w:rPr>
+        <w:t>The Administrator Portal offers comprehensive environmental monitoring tools, including real-time AQI dashboards, pollutant analysis, weather monitoring, GIS visualization, AI diagnostics, and source attribution interfaces.</w:t>
+      </w:r>
+    </w:p>
+    <w:p>
+      <w:pPr>
+        <w:jc w:val="both"/>
+        <w:rPr>
+          <w:rFonts w:ascii="Times New Roman" w:hAnsi="Times New Roman" w:cs="Times New Roman"/>
+          <w:sz w:val="24"/>
+          <w:szCs w:val="24"/>
+        </w:rPr>
+      </w:pPr>
+      <w:r>
+        <w:rPr>
+          <w:rFonts w:ascii="Times New Roman" w:hAnsi="Times New Roman" w:cs="Times New Roman"/>
+          <w:sz w:val="24"/>
+          <w:szCs w:val="24"/>
+        </w:rPr>
+        <w:t>The Citizen Portal presents environmental information in a simplified format, allowing users to monitor current AQI values, weather conditions, pollutant concentrations, and health advisories.</w:t>
+      </w:r>
+    </w:p>
+    <w:p>
+      <w:pPr>
+        <w:jc w:val="both"/>
+        <w:rPr>
+          <w:rFonts w:ascii="Times New Roman" w:hAnsi="Times New Roman" w:cs="Times New Roman"/>
+          <w:sz w:val="24"/>
+          <w:szCs w:val="24"/>
+        </w:rPr>
+      </w:pPr>
+      <w:r>
+        <w:rPr>
+          <w:rFonts w:ascii="Times New Roman" w:hAnsi="Times New Roman" w:cs="Times New Roman"/>
+          <w:sz w:val="24"/>
+          <w:szCs w:val="24"/>
+        </w:rPr>
+        <w:t>The portal is designed to be intuitive, responsive, and scalable, ensuring ease of use for both administrators and general users.</w:t>
+      </w:r>
+    </w:p>
+    <w:p>
+      <w:pPr>
+        <w:jc w:val="both"/>
+        <w:rPr>
+          <w:rFonts w:ascii="Times New Roman" w:hAnsi="Times New Roman" w:cs="Times New Roman"/>
+          <w:b/>
+          <w:bCs/>
+          <w:sz w:val="28"/>
+          <w:szCs w:val="28"/>
+        </w:rPr>
+      </w:pPr>
+    </w:p>
+    <w:p>
+      <w:pPr>
+        <w:jc w:val="both"/>
+        <w:rPr>
+          <w:rFonts w:ascii="Times New Roman" w:hAnsi="Times New Roman" w:cs="Times New Roman"/>
+          <w:b/>
+          <w:bCs/>
+          <w:sz w:val="28"/>
+          <w:szCs w:val="28"/>
+        </w:rPr>
+      </w:pPr>
+      <w:r>
+        <w:rPr>
+          <w:rFonts w:ascii="Times New Roman" w:hAnsi="Times New Roman" w:cs="Times New Roman"/>
+          <w:b/>
+          <w:bCs/>
+          <w:sz w:val="28"/>
+          <w:szCs w:val="28"/>
+        </w:rPr>
+        <w:t>System Workflow</w:t>
+      </w:r>
+    </w:p>
+    <w:p>
+      <w:pPr>
+        <w:jc w:val="both"/>
+        <w:rPr>
+          <w:rFonts w:ascii="Times New Roman" w:hAnsi="Times New Roman" w:cs="Times New Roman"/>
+          <w:sz w:val="24"/>
+          <w:szCs w:val="24"/>
+        </w:rPr>
+      </w:pPr>
+      <w:r>
+        <w:rPr>
+          <w:rFonts w:ascii="Times New Roman" w:hAnsi="Times New Roman" w:cs="Times New Roman"/>
+          <w:sz w:val="24"/>
+          <w:szCs w:val="24"/>
+        </w:rPr>
+        <w:t>The operational workflow of the Urban Air Quality Intelligence Platform begins with collecting environmental data from external APIs. The backend processes and validates the incoming information before storing it in MongoDB. RESTful APIs expose the processed data to the React frontend, where it is displayed through interactive dashboards and visualizations.</w:t>
+      </w:r>
+    </w:p>
+    <w:p>
+      <w:pPr>
+        <w:jc w:val="both"/>
+        <w:rPr>
+          <w:rFonts w:ascii="Times New Roman" w:hAnsi="Times New Roman" w:cs="Times New Roman"/>
+          <w:sz w:val="24"/>
+          <w:szCs w:val="24"/>
+        </w:rPr>
+      </w:pPr>
+      <w:r>
+        <w:rPr>
+          <w:rFonts w:ascii="Times New Roman" w:hAnsi="Times New Roman" w:cs="Times New Roman"/>
+          <w:sz w:val="24"/>
+          <w:szCs w:val="24"/>
+        </w:rPr>
+        <w:t>The modular workflow enables efficient communication between all system components while allowing future integration of AI-based analytics and forecasting modules.</w:t>
+      </w:r>
+    </w:p>
+    <w:p>
+      <w:pPr>
+        <w:jc w:val="both"/>
+        <w:rPr>
+          <w:rFonts w:ascii="Times New Roman" w:hAnsi="Times New Roman" w:cs="Times New Roman"/>
+          <w:sz w:val="24"/>
+          <w:szCs w:val="24"/>
+        </w:rPr>
+      </w:pPr>
+    </w:p>
+    <w:p>
+      <w:pPr>
+        <w:jc w:val="both"/>
+        <w:rPr>
+          <w:rFonts w:ascii="Times New Roman" w:hAnsi="Times New Roman" w:cs="Times New Roman"/>
+          <w:sz w:val="24"/>
+          <w:szCs w:val="24"/>
+        </w:rPr>
+      </w:pPr>
+    </w:p>
+    <w:p>
+      <w:pPr>
+        <w:jc w:val="both"/>
+        <w:rPr>
+          <w:rFonts w:ascii="Times New Roman" w:hAnsi="Times New Roman" w:cs="Times New Roman"/>
+          <w:b/>
+          <w:bCs/>
+          <w:sz w:val="28"/>
+          <w:szCs w:val="28"/>
+        </w:rPr>
+      </w:pPr>
+      <w:r>
+        <w:rPr>
+          <w:rFonts w:ascii="Times New Roman" w:hAnsi="Times New Roman" w:cs="Times New Roman"/>
+          <w:b/>
+          <w:bCs/>
+          <w:sz w:val="28"/>
+          <w:szCs w:val="28"/>
+        </w:rPr>
+        <w:lastRenderedPageBreak/>
+        <w:t>Workflow:</w:t>
+      </w:r>
+    </w:p>
+    <w:p>
+      <w:pPr>
+        <w:jc w:val="center"/>
+        <w:rPr>
+          <w:rFonts w:ascii="Times New Roman" w:hAnsi="Times New Roman" w:cs="Times New Roman"/>
+          <w:b/>
+          <w:bCs/>
+          <w:sz w:val="28"/>
+          <w:szCs w:val="28"/>
+        </w:rPr>
+      </w:pPr>
+      <w:r>
+        <w:rPr>
+          <w:rFonts w:ascii="Times New Roman" w:hAnsi="Times New Roman" w:cs="Times New Roman"/>
+          <w:b/>
+          <w:bCs/>
+          <w:sz w:val="28"/>
+          <w:szCs w:val="28"/>
+        </w:rPr>
+        <w:t>External APIs</w:t>
+      </w:r>
+    </w:p>
+    <w:p>
+      <w:pPr>
+        <w:jc w:val="center"/>
+        <w:rPr>
+          <w:rFonts w:ascii="Times New Roman" w:hAnsi="Times New Roman" w:cs="Times New Roman"/>
+          <w:b/>
+          <w:bCs/>
+          <w:sz w:val="28"/>
+          <w:szCs w:val="28"/>
+        </w:rPr>
+      </w:pPr>
+      <w:r>
+        <w:rPr>
+          <w:rFonts w:ascii="Times New Roman" w:hAnsi="Times New Roman" w:cs="Times New Roman"/>
+          <w:b/>
+          <w:bCs/>
+          <w:sz w:val="28"/>
+          <w:szCs w:val="28"/>
+        </w:rPr>
+        <w:t>↓</w:t>
+      </w:r>
+    </w:p>
+    <w:p>
+      <w:pPr>
+        <w:jc w:val="center"/>
+        <w:rPr>
+          <w:rFonts w:ascii="Times New Roman" w:hAnsi="Times New Roman" w:cs="Times New Roman"/>
+          <w:b/>
+          <w:bCs/>
+          <w:sz w:val="28"/>
+          <w:szCs w:val="28"/>
+        </w:rPr>
+      </w:pPr>
+      <w:r>
+        <w:rPr>
+          <w:rFonts w:ascii="Times New Roman" w:hAnsi="Times New Roman" w:cs="Times New Roman"/>
+          <w:b/>
+          <w:bCs/>
+          <w:sz w:val="28"/>
+          <w:szCs w:val="28"/>
+        </w:rPr>
+        <w:t>Data Collection</w:t>
+      </w:r>
+    </w:p>
+    <w:p>
+      <w:pPr>
+        <w:jc w:val="center"/>
+        <w:rPr>
+          <w:rFonts w:ascii="Times New Roman" w:hAnsi="Times New Roman" w:cs="Times New Roman"/>
+          <w:b/>
+          <w:bCs/>
+          <w:sz w:val="28"/>
+          <w:szCs w:val="28"/>
+        </w:rPr>
+      </w:pPr>
+      <w:r>
+        <w:rPr>
+          <w:rFonts w:ascii="Times New Roman" w:hAnsi="Times New Roman" w:cs="Times New Roman"/>
+          <w:b/>
+          <w:bCs/>
+          <w:sz w:val="28"/>
+          <w:szCs w:val="28"/>
+        </w:rPr>
+        <w:t>↓</w:t>
+      </w:r>
+    </w:p>
+    <w:p>
+      <w:pPr>
+        <w:jc w:val="center"/>
+        <w:rPr>
+          <w:rFonts w:ascii="Times New Roman" w:hAnsi="Times New Roman" w:cs="Times New Roman"/>
+          <w:b/>
+          <w:bCs/>
+          <w:sz w:val="28"/>
+          <w:szCs w:val="28"/>
+        </w:rPr>
+      </w:pPr>
+      <w:r>
+        <w:rPr>
+          <w:rFonts w:ascii="Times New Roman" w:hAnsi="Times New Roman" w:cs="Times New Roman"/>
+          <w:b/>
+          <w:bCs/>
+          <w:sz w:val="28"/>
+          <w:szCs w:val="28"/>
+        </w:rPr>
+        <w:t>FastAPI Backend</w:t>
+      </w:r>
+    </w:p>
+    <w:p>
+      <w:pPr>
+        <w:jc w:val="center"/>
+        <w:rPr>
+          <w:rFonts w:ascii="Times New Roman" w:hAnsi="Times New Roman" w:cs="Times New Roman"/>
+          <w:b/>
+          <w:bCs/>
+          <w:sz w:val="28"/>
+          <w:szCs w:val="28"/>
+        </w:rPr>
+      </w:pPr>
+      <w:r>
+        <w:rPr>
+          <w:rFonts w:ascii="Times New Roman" w:hAnsi="Times New Roman" w:cs="Times New Roman"/>
+          <w:b/>
+          <w:bCs/>
+          <w:sz w:val="28"/>
+          <w:szCs w:val="28"/>
+        </w:rPr>
+        <w:t>↓</w:t>
+      </w:r>
+    </w:p>
+    <w:p>
+      <w:pPr>
+        <w:jc w:val="center"/>
+        <w:rPr>
+          <w:rFonts w:ascii="Times New Roman" w:hAnsi="Times New Roman" w:cs="Times New Roman"/>
+          <w:b/>
+          <w:bCs/>
+          <w:sz w:val="28"/>
+          <w:szCs w:val="28"/>
+        </w:rPr>
+      </w:pPr>
+      <w:r>
+        <w:rPr>
+          <w:rFonts w:ascii="Times New Roman" w:hAnsi="Times New Roman" w:cs="Times New Roman"/>
+          <w:b/>
+          <w:bCs/>
+          <w:sz w:val="28"/>
+          <w:szCs w:val="28"/>
+        </w:rPr>
+        <w:t>MongoDB Database</w:t>
+      </w:r>
+    </w:p>
+    <w:p>
+      <w:pPr>
+        <w:jc w:val="center"/>
+        <w:rPr>
+          <w:rFonts w:ascii="Times New Roman" w:hAnsi="Times New Roman" w:cs="Times New Roman"/>
+          <w:b/>
+          <w:bCs/>
+          <w:sz w:val="28"/>
+          <w:szCs w:val="28"/>
+        </w:rPr>
+      </w:pPr>
+      <w:r>
+        <w:rPr>
+          <w:rFonts w:ascii="Times New Roman" w:hAnsi="Times New Roman" w:cs="Times New Roman"/>
+          <w:b/>
+          <w:bCs/>
+          <w:sz w:val="28"/>
+          <w:szCs w:val="28"/>
+        </w:rPr>
+        <w:t>↓</w:t>
+      </w:r>
+    </w:p>
+    <w:p>
+      <w:pPr>
+        <w:jc w:val="center"/>
+        <w:rPr>
+          <w:rFonts w:ascii="Times New Roman" w:hAnsi="Times New Roman" w:cs="Times New Roman"/>
+          <w:b/>
+          <w:bCs/>
+          <w:sz w:val="28"/>
+          <w:szCs w:val="28"/>
+        </w:rPr>
+      </w:pPr>
+      <w:r>
+        <w:rPr>
+          <w:rFonts w:ascii="Times New Roman" w:hAnsi="Times New Roman" w:cs="Times New Roman"/>
+          <w:b/>
+          <w:bCs/>
+          <w:sz w:val="28"/>
+          <w:szCs w:val="28"/>
+        </w:rPr>
+        <w:t>REST APIs</w:t>
+      </w:r>
+    </w:p>
+    <w:p>
+      <w:pPr>
+        <w:jc w:val="center"/>
+        <w:rPr>
+          <w:rFonts w:ascii="Times New Roman" w:hAnsi="Times New Roman" w:cs="Times New Roman"/>
+          <w:b/>
+          <w:bCs/>
+          <w:sz w:val="28"/>
+          <w:szCs w:val="28"/>
+        </w:rPr>
+      </w:pPr>
+      <w:r>
+        <w:rPr>
+          <w:rFonts w:ascii="Times New Roman" w:hAnsi="Times New Roman" w:cs="Times New Roman"/>
+          <w:b/>
+          <w:bCs/>
+          <w:sz w:val="28"/>
+          <w:szCs w:val="28"/>
+        </w:rPr>
+        <w:t>↓</w:t>
+      </w:r>
+    </w:p>
+    <w:p>
+      <w:pPr>
+        <w:jc w:val="center"/>
+        <w:rPr>
+          <w:rFonts w:ascii="Times New Roman" w:hAnsi="Times New Roman" w:cs="Times New Roman"/>
+          <w:b/>
+          <w:bCs/>
+          <w:sz w:val="28"/>
+          <w:szCs w:val="28"/>
+        </w:rPr>
+      </w:pPr>
+      <w:r>
+        <w:rPr>
+          <w:rFonts w:ascii="Times New Roman" w:hAnsi="Times New Roman" w:cs="Times New Roman"/>
+          <w:b/>
+          <w:bCs/>
+          <w:sz w:val="28"/>
+          <w:szCs w:val="28"/>
+        </w:rPr>
+        <w:t>React Frontend</w:t>
+      </w:r>
+    </w:p>
+    <w:p>
+      <w:pPr>
+        <w:jc w:val="center"/>
+        <w:rPr>
+          <w:rFonts w:ascii="Times New Roman" w:hAnsi="Times New Roman" w:cs="Times New Roman"/>
+          <w:b/>
+          <w:bCs/>
+          <w:sz w:val="28"/>
+          <w:szCs w:val="28"/>
+        </w:rPr>
+      </w:pPr>
+      <w:r>
+        <w:rPr>
+          <w:rFonts w:ascii="Times New Roman" w:hAnsi="Times New Roman" w:cs="Times New Roman"/>
+          <w:b/>
+          <w:bCs/>
+          <w:sz w:val="28"/>
+          <w:szCs w:val="28"/>
+        </w:rPr>
+        <w:t>↓</w:t>
+      </w:r>
+    </w:p>
+    <w:p>
+      <w:pPr>
+        <w:jc w:val="center"/>
+        <w:rPr>
+          <w:rFonts w:ascii="Times New Roman" w:hAnsi="Times New Roman" w:cs="Times New Roman"/>
+          <w:b/>
+          <w:bCs/>
+          <w:sz w:val="28"/>
+          <w:szCs w:val="28"/>
+        </w:rPr>
+      </w:pPr>
+      <w:r>
+        <w:rPr>
+          <w:rFonts w:ascii="Times New Roman" w:hAnsi="Times New Roman" w:cs="Times New Roman"/>
+          <w:b/>
+          <w:bCs/>
+          <w:sz w:val="28"/>
+          <w:szCs w:val="28"/>
+        </w:rPr>
+        <w:t>Administrator &amp; Citizen Portals</w:t>
+      </w:r>
+    </w:p>
+    <w:p>
+      <w:pPr>
+        <w:jc w:val="both"/>
+        <w:rPr>
+          <w:rFonts w:ascii="Times New Roman" w:hAnsi="Times New Roman" w:cs="Times New Roman"/>
+          <w:sz w:val="24"/>
+          <w:szCs w:val="24"/>
         </w:rPr>
       </w:pPr>
     </w:p>
@@ -7506,6 +9300,155 @@
     </w:lvl>
   </w:abstractNum>
   <w:abstractNum w:abstractNumId="1" w15:restartNumberingAfterBreak="0">
+    <w:nsid w:val="060D49A2"/>
+    <w:multiLevelType w:val="multilevel"/>
+    <w:tmpl w:val="42FE8880"/>
+    <w:lvl w:ilvl="0">
+      <w:start w:val="1"/>
+      <w:numFmt w:val="bullet"/>
+      <w:lvlText w:val=""/>
+      <w:lvlJc w:val="left"/>
+      <w:pPr>
+        <w:tabs>
+          <w:tab w:val="num" w:pos="720"/>
+        </w:tabs>
+        <w:ind w:left="720" w:hanging="360"/>
+      </w:pPr>
+      <w:rPr>
+        <w:rFonts w:ascii="Symbol" w:hAnsi="Symbol" w:hint="default"/>
+        <w:sz w:val="20"/>
+      </w:rPr>
+    </w:lvl>
+    <w:lvl w:ilvl="1" w:tentative="1">
+      <w:start w:val="1"/>
+      <w:numFmt w:val="bullet"/>
+      <w:lvlText w:val="o"/>
+      <w:lvlJc w:val="left"/>
+      <w:pPr>
+        <w:tabs>
+          <w:tab w:val="num" w:pos="1440"/>
+        </w:tabs>
+        <w:ind w:left="1440" w:hanging="360"/>
+      </w:pPr>
+      <w:rPr>
+        <w:rFonts w:ascii="Courier New" w:hAnsi="Courier New" w:hint="default"/>
+        <w:sz w:val="20"/>
+      </w:rPr>
+    </w:lvl>
+    <w:lvl w:ilvl="2" w:tentative="1">
+      <w:start w:val="1"/>
+      <w:numFmt w:val="bullet"/>
+      <w:lvlText w:val=""/>
+      <w:lvlJc w:val="left"/>
+      <w:pPr>
+        <w:tabs>
+          <w:tab w:val="num" w:pos="2160"/>
+        </w:tabs>
+        <w:ind w:left="2160" w:hanging="360"/>
+      </w:pPr>
+      <w:rPr>
+        <w:rFonts w:ascii="Wingdings" w:hAnsi="Wingdings" w:hint="default"/>
+        <w:sz w:val="20"/>
+      </w:rPr>
+    </w:lvl>
+    <w:lvl w:ilvl="3" w:tentative="1">
+      <w:start w:val="1"/>
+      <w:numFmt w:val="bullet"/>
+      <w:lvlText w:val=""/>
+      <w:lvlJc w:val="left"/>
+      <w:pPr>
+        <w:tabs>
+          <w:tab w:val="num" w:pos="2880"/>
+        </w:tabs>
+        <w:ind w:left="2880" w:hanging="360"/>
+      </w:pPr>
+      <w:rPr>
+        <w:rFonts w:ascii="Wingdings" w:hAnsi="Wingdings" w:hint="default"/>
+        <w:sz w:val="20"/>
+      </w:rPr>
+    </w:lvl>
+    <w:lvl w:ilvl="4" w:tentative="1">
+      <w:start w:val="1"/>
+      <w:numFmt w:val="bullet"/>
+      <w:lvlText w:val=""/>
+      <w:lvlJc w:val="left"/>
+      <w:pPr>
+        <w:tabs>
+          <w:tab w:val="num" w:pos="3600"/>
+        </w:tabs>
+        <w:ind w:left="3600" w:hanging="360"/>
+      </w:pPr>
+      <w:rPr>
+        <w:rFonts w:ascii="Wingdings" w:hAnsi="Wingdings" w:hint="default"/>
+        <w:sz w:val="20"/>
+      </w:rPr>
+    </w:lvl>
+    <w:lvl w:ilvl="5" w:tentative="1">
+      <w:start w:val="1"/>
+      <w:numFmt w:val="bullet"/>
+      <w:lvlText w:val=""/>
+      <w:lvlJc w:val="left"/>
+      <w:pPr>
+        <w:tabs>
+          <w:tab w:val="num" w:pos="4320"/>
+        </w:tabs>
+        <w:ind w:left="4320" w:hanging="360"/>
+      </w:pPr>
+      <w:rPr>
+        <w:rFonts w:ascii="Wingdings" w:hAnsi="Wingdings" w:hint="default"/>
+        <w:sz w:val="20"/>
+      </w:rPr>
+    </w:lvl>
+    <w:lvl w:ilvl="6" w:tentative="1">
+      <w:start w:val="1"/>
+      <w:numFmt w:val="bullet"/>
+      <w:lvlText w:val=""/>
+      <w:lvlJc w:val="left"/>
+      <w:pPr>
+        <w:tabs>
+          <w:tab w:val="num" w:pos="5040"/>
+        </w:tabs>
+        <w:ind w:left="5040" w:hanging="360"/>
+      </w:pPr>
+      <w:rPr>
+        <w:rFonts w:ascii="Wingdings" w:hAnsi="Wingdings" w:hint="default"/>
+        <w:sz w:val="20"/>
+      </w:rPr>
+    </w:lvl>
+    <w:lvl w:ilvl="7" w:tentative="1">
+      <w:start w:val="1"/>
+      <w:numFmt w:val="bullet"/>
+      <w:lvlText w:val=""/>
+      <w:lvlJc w:val="left"/>
+      <w:pPr>
+        <w:tabs>
+          <w:tab w:val="num" w:pos="5760"/>
+        </w:tabs>
+        <w:ind w:left="5760" w:hanging="360"/>
+      </w:pPr>
+      <w:rPr>
+        <w:rFonts w:ascii="Wingdings" w:hAnsi="Wingdings" w:hint="default"/>
+        <w:sz w:val="20"/>
+      </w:rPr>
+    </w:lvl>
+    <w:lvl w:ilvl="8" w:tentative="1">
+      <w:start w:val="1"/>
+      <w:numFmt w:val="bullet"/>
+      <w:lvlText w:val=""/>
+      <w:lvlJc w:val="left"/>
+      <w:pPr>
+        <w:tabs>
+          <w:tab w:val="num" w:pos="6480"/>
+        </w:tabs>
+        <w:ind w:left="6480" w:hanging="360"/>
+      </w:pPr>
+      <w:rPr>
+        <w:rFonts w:ascii="Wingdings" w:hAnsi="Wingdings" w:hint="default"/>
+        <w:sz w:val="20"/>
+      </w:rPr>
+    </w:lvl>
+  </w:abstractNum>
+  <w:abstractNum w:abstractNumId="2" w15:restartNumberingAfterBreak="0">
     <w:nsid w:val="06E065CB"/>
     <w:multiLevelType w:val="multilevel"/>
     <w:tmpl w:val="AE5ED320"/>
@@ -7654,7 +9597,7 @@
       </w:rPr>
     </w:lvl>
   </w:abstractNum>
-  <w:abstractNum w:abstractNumId="2" w15:restartNumberingAfterBreak="0">
+  <w:abstractNum w:abstractNumId="3" w15:restartNumberingAfterBreak="0">
     <w:nsid w:val="10F36CAE"/>
     <w:multiLevelType w:val="multilevel"/>
     <w:tmpl w:val="3D183BC0"/>
@@ -7803,7 +9746,156 @@
       </w:rPr>
     </w:lvl>
   </w:abstractNum>
-  <w:abstractNum w:abstractNumId="3" w15:restartNumberingAfterBreak="0">
+  <w:abstractNum w:abstractNumId="4" w15:restartNumberingAfterBreak="0">
+    <w:nsid w:val="12376BB8"/>
+    <w:multiLevelType w:val="multilevel"/>
+    <w:tmpl w:val="7E0AD194"/>
+    <w:lvl w:ilvl="0">
+      <w:start w:val="1"/>
+      <w:numFmt w:val="bullet"/>
+      <w:lvlText w:val=""/>
+      <w:lvlJc w:val="left"/>
+      <w:pPr>
+        <w:tabs>
+          <w:tab w:val="num" w:pos="720"/>
+        </w:tabs>
+        <w:ind w:left="720" w:hanging="360"/>
+      </w:pPr>
+      <w:rPr>
+        <w:rFonts w:ascii="Symbol" w:hAnsi="Symbol" w:hint="default"/>
+        <w:sz w:val="20"/>
+      </w:rPr>
+    </w:lvl>
+    <w:lvl w:ilvl="1" w:tentative="1">
+      <w:start w:val="1"/>
+      <w:numFmt w:val="bullet"/>
+      <w:lvlText w:val="o"/>
+      <w:lvlJc w:val="left"/>
+      <w:pPr>
+        <w:tabs>
+          <w:tab w:val="num" w:pos="1440"/>
+        </w:tabs>
+        <w:ind w:left="1440" w:hanging="360"/>
+      </w:pPr>
+      <w:rPr>
+        <w:rFonts w:ascii="Courier New" w:hAnsi="Courier New" w:hint="default"/>
+        <w:sz w:val="20"/>
+      </w:rPr>
+    </w:lvl>
+    <w:lvl w:ilvl="2" w:tentative="1">
+      <w:start w:val="1"/>
+      <w:numFmt w:val="bullet"/>
+      <w:lvlText w:val=""/>
+      <w:lvlJc w:val="left"/>
+      <w:pPr>
+        <w:tabs>
+          <w:tab w:val="num" w:pos="2160"/>
+        </w:tabs>
+        <w:ind w:left="2160" w:hanging="360"/>
+      </w:pPr>
+      <w:rPr>
+        <w:rFonts w:ascii="Wingdings" w:hAnsi="Wingdings" w:hint="default"/>
+        <w:sz w:val="20"/>
+      </w:rPr>
+    </w:lvl>
+    <w:lvl w:ilvl="3" w:tentative="1">
+      <w:start w:val="1"/>
+      <w:numFmt w:val="bullet"/>
+      <w:lvlText w:val=""/>
+      <w:lvlJc w:val="left"/>
+      <w:pPr>
+        <w:tabs>
+          <w:tab w:val="num" w:pos="2880"/>
+        </w:tabs>
+        <w:ind w:left="2880" w:hanging="360"/>
+      </w:pPr>
+      <w:rPr>
+        <w:rFonts w:ascii="Wingdings" w:hAnsi="Wingdings" w:hint="default"/>
+        <w:sz w:val="20"/>
+      </w:rPr>
+    </w:lvl>
+    <w:lvl w:ilvl="4" w:tentative="1">
+      <w:start w:val="1"/>
+      <w:numFmt w:val="bullet"/>
+      <w:lvlText w:val=""/>
+      <w:lvlJc w:val="left"/>
+      <w:pPr>
+        <w:tabs>
+          <w:tab w:val="num" w:pos="3600"/>
+        </w:tabs>
+        <w:ind w:left="3600" w:hanging="360"/>
+      </w:pPr>
+      <w:rPr>
+        <w:rFonts w:ascii="Wingdings" w:hAnsi="Wingdings" w:hint="default"/>
+        <w:sz w:val="20"/>
+      </w:rPr>
+    </w:lvl>
+    <w:lvl w:ilvl="5" w:tentative="1">
+      <w:start w:val="1"/>
+      <w:numFmt w:val="bullet"/>
+      <w:lvlText w:val=""/>
+      <w:lvlJc w:val="left"/>
+      <w:pPr>
+        <w:tabs>
+          <w:tab w:val="num" w:pos="4320"/>
+        </w:tabs>
+        <w:ind w:left="4320" w:hanging="360"/>
+      </w:pPr>
+      <w:rPr>
+        <w:rFonts w:ascii="Wingdings" w:hAnsi="Wingdings" w:hint="default"/>
+        <w:sz w:val="20"/>
+      </w:rPr>
+    </w:lvl>
+    <w:lvl w:ilvl="6" w:tentative="1">
+      <w:start w:val="1"/>
+      <w:numFmt w:val="bullet"/>
+      <w:lvlText w:val=""/>
+      <w:lvlJc w:val="left"/>
+      <w:pPr>
+        <w:tabs>
+          <w:tab w:val="num" w:pos="5040"/>
+        </w:tabs>
+        <w:ind w:left="5040" w:hanging="360"/>
+      </w:pPr>
+      <w:rPr>
+        <w:rFonts w:ascii="Wingdings" w:hAnsi="Wingdings" w:hint="default"/>
+        <w:sz w:val="20"/>
+      </w:rPr>
+    </w:lvl>
+    <w:lvl w:ilvl="7" w:tentative="1">
+      <w:start w:val="1"/>
+      <w:numFmt w:val="bullet"/>
+      <w:lvlText w:val=""/>
+      <w:lvlJc w:val="left"/>
+      <w:pPr>
+        <w:tabs>
+          <w:tab w:val="num" w:pos="5760"/>
+        </w:tabs>
+        <w:ind w:left="5760" w:hanging="360"/>
+      </w:pPr>
+      <w:rPr>
+        <w:rFonts w:ascii="Wingdings" w:hAnsi="Wingdings" w:hint="default"/>
+        <w:sz w:val="20"/>
+      </w:rPr>
+    </w:lvl>
+    <w:lvl w:ilvl="8" w:tentative="1">
+      <w:start w:val="1"/>
+      <w:numFmt w:val="bullet"/>
+      <w:lvlText w:val=""/>
+      <w:lvlJc w:val="left"/>
+      <w:pPr>
+        <w:tabs>
+          <w:tab w:val="num" w:pos="6480"/>
+        </w:tabs>
+        <w:ind w:left="6480" w:hanging="360"/>
+      </w:pPr>
+      <w:rPr>
+        <w:rFonts w:ascii="Wingdings" w:hAnsi="Wingdings" w:hint="default"/>
+        <w:sz w:val="20"/>
+      </w:rPr>
+    </w:lvl>
+  </w:abstractNum>
+  <w:abstractNum w:abstractNumId="5" w15:restartNumberingAfterBreak="0">
     <w:nsid w:val="124B7FB0"/>
     <w:multiLevelType w:val="multilevel"/>
     <w:tmpl w:val="9D3EEC46"/>
@@ -7952,7 +10044,7 @@
       </w:rPr>
     </w:lvl>
   </w:abstractNum>
-  <w:abstractNum w:abstractNumId="4" w15:restartNumberingAfterBreak="0">
+  <w:abstractNum w:abstractNumId="6" w15:restartNumberingAfterBreak="0">
     <w:nsid w:val="162541DF"/>
     <w:multiLevelType w:val="multilevel"/>
     <w:tmpl w:val="727A5428"/>
@@ -8101,7 +10193,7 @@
       </w:rPr>
     </w:lvl>
   </w:abstractNum>
-  <w:abstractNum w:abstractNumId="5" w15:restartNumberingAfterBreak="0">
+  <w:abstractNum w:abstractNumId="7" w15:restartNumberingAfterBreak="0">
     <w:nsid w:val="18645D8A"/>
     <w:multiLevelType w:val="multilevel"/>
     <w:tmpl w:val="A33499EC"/>
@@ -8250,7 +10342,7 @@
       </w:rPr>
     </w:lvl>
   </w:abstractNum>
-  <w:abstractNum w:abstractNumId="6" w15:restartNumberingAfterBreak="0">
+  <w:abstractNum w:abstractNumId="8" w15:restartNumberingAfterBreak="0">
     <w:nsid w:val="18B347DA"/>
     <w:multiLevelType w:val="multilevel"/>
     <w:tmpl w:val="8488E7B4"/>
@@ -8399,7 +10491,156 @@
       </w:rPr>
     </w:lvl>
   </w:abstractNum>
-  <w:abstractNum w:abstractNumId="7" w15:restartNumberingAfterBreak="0">
+  <w:abstractNum w:abstractNumId="9" w15:restartNumberingAfterBreak="0">
+    <w:nsid w:val="1ACC3671"/>
+    <w:multiLevelType w:val="multilevel"/>
+    <w:tmpl w:val="8294F7D0"/>
+    <w:lvl w:ilvl="0">
+      <w:start w:val="1"/>
+      <w:numFmt w:val="bullet"/>
+      <w:lvlText w:val=""/>
+      <w:lvlJc w:val="left"/>
+      <w:pPr>
+        <w:tabs>
+          <w:tab w:val="num" w:pos="720"/>
+        </w:tabs>
+        <w:ind w:left="720" w:hanging="360"/>
+      </w:pPr>
+      <w:rPr>
+        <w:rFonts w:ascii="Symbol" w:hAnsi="Symbol" w:hint="default"/>
+        <w:sz w:val="20"/>
+      </w:rPr>
+    </w:lvl>
+    <w:lvl w:ilvl="1" w:tentative="1">
+      <w:start w:val="1"/>
+      <w:numFmt w:val="bullet"/>
+      <w:lvlText w:val="o"/>
+      <w:lvlJc w:val="left"/>
+      <w:pPr>
+        <w:tabs>
+          <w:tab w:val="num" w:pos="1440"/>
+        </w:tabs>
+        <w:ind w:left="1440" w:hanging="360"/>
+      </w:pPr>
+      <w:rPr>
+        <w:rFonts w:ascii="Courier New" w:hAnsi="Courier New" w:hint="default"/>
+        <w:sz w:val="20"/>
+      </w:rPr>
+    </w:lvl>
+    <w:lvl w:ilvl="2" w:tentative="1">
+      <w:start w:val="1"/>
+      <w:numFmt w:val="bullet"/>
+      <w:lvlText w:val=""/>
+      <w:lvlJc w:val="left"/>
+      <w:pPr>
+        <w:tabs>
+          <w:tab w:val="num" w:pos="2160"/>
+        </w:tabs>
+        <w:ind w:left="2160" w:hanging="360"/>
+      </w:pPr>
+      <w:rPr>
+        <w:rFonts w:ascii="Wingdings" w:hAnsi="Wingdings" w:hint="default"/>
+        <w:sz w:val="20"/>
+      </w:rPr>
+    </w:lvl>
+    <w:lvl w:ilvl="3" w:tentative="1">
+      <w:start w:val="1"/>
+      <w:numFmt w:val="bullet"/>
+      <w:lvlText w:val=""/>
+      <w:lvlJc w:val="left"/>
+      <w:pPr>
+        <w:tabs>
+          <w:tab w:val="num" w:pos="2880"/>
+        </w:tabs>
+        <w:ind w:left="2880" w:hanging="360"/>
+      </w:pPr>
+      <w:rPr>
+        <w:rFonts w:ascii="Wingdings" w:hAnsi="Wingdings" w:hint="default"/>
+        <w:sz w:val="20"/>
+      </w:rPr>
+    </w:lvl>
+    <w:lvl w:ilvl="4" w:tentative="1">
+      <w:start w:val="1"/>
+      <w:numFmt w:val="bullet"/>
+      <w:lvlText w:val=""/>
+      <w:lvlJc w:val="left"/>
+      <w:pPr>
+        <w:tabs>
+          <w:tab w:val="num" w:pos="3600"/>
+        </w:tabs>
+        <w:ind w:left="3600" w:hanging="360"/>
+      </w:pPr>
+      <w:rPr>
+        <w:rFonts w:ascii="Wingdings" w:hAnsi="Wingdings" w:hint="default"/>
+        <w:sz w:val="20"/>
+      </w:rPr>
+    </w:lvl>
+    <w:lvl w:ilvl="5" w:tentative="1">
+      <w:start w:val="1"/>
+      <w:numFmt w:val="bullet"/>
+      <w:lvlText w:val=""/>
+      <w:lvlJc w:val="left"/>
+      <w:pPr>
+        <w:tabs>
+          <w:tab w:val="num" w:pos="4320"/>
+        </w:tabs>
+        <w:ind w:left="4320" w:hanging="360"/>
+      </w:pPr>
+      <w:rPr>
+        <w:rFonts w:ascii="Wingdings" w:hAnsi="Wingdings" w:hint="default"/>
+        <w:sz w:val="20"/>
+      </w:rPr>
+    </w:lvl>
+    <w:lvl w:ilvl="6" w:tentative="1">
+      <w:start w:val="1"/>
+      <w:numFmt w:val="bullet"/>
+      <w:lvlText w:val=""/>
+      <w:lvlJc w:val="left"/>
+      <w:pPr>
+        <w:tabs>
+          <w:tab w:val="num" w:pos="5040"/>
+        </w:tabs>
+        <w:ind w:left="5040" w:hanging="360"/>
+      </w:pPr>
+      <w:rPr>
+        <w:rFonts w:ascii="Wingdings" w:hAnsi="Wingdings" w:hint="default"/>
+        <w:sz w:val="20"/>
+      </w:rPr>
+    </w:lvl>
+    <w:lvl w:ilvl="7" w:tentative="1">
+      <w:start w:val="1"/>
+      <w:numFmt w:val="bullet"/>
+      <w:lvlText w:val=""/>
+      <w:lvlJc w:val="left"/>
+      <w:pPr>
+        <w:tabs>
+          <w:tab w:val="num" w:pos="5760"/>
+        </w:tabs>
+        <w:ind w:left="5760" w:hanging="360"/>
+      </w:pPr>
+      <w:rPr>
+        <w:rFonts w:ascii="Wingdings" w:hAnsi="Wingdings" w:hint="default"/>
+        <w:sz w:val="20"/>
+      </w:rPr>
+    </w:lvl>
+    <w:lvl w:ilvl="8" w:tentative="1">
+      <w:start w:val="1"/>
+      <w:numFmt w:val="bullet"/>
+      <w:lvlText w:val=""/>
+      <w:lvlJc w:val="left"/>
+      <w:pPr>
+        <w:tabs>
+          <w:tab w:val="num" w:pos="6480"/>
+        </w:tabs>
+        <w:ind w:left="6480" w:hanging="360"/>
+      </w:pPr>
+      <w:rPr>
+        <w:rFonts w:ascii="Wingdings" w:hAnsi="Wingdings" w:hint="default"/>
+        <w:sz w:val="20"/>
+      </w:rPr>
+    </w:lvl>
+  </w:abstractNum>
+  <w:abstractNum w:abstractNumId="10" w15:restartNumberingAfterBreak="0">
     <w:nsid w:val="213B0564"/>
     <w:multiLevelType w:val="multilevel"/>
     <w:tmpl w:val="E5DA990C"/>
@@ -8548,7 +10789,7 @@
       </w:rPr>
     </w:lvl>
   </w:abstractNum>
-  <w:abstractNum w:abstractNumId="8" w15:restartNumberingAfterBreak="0">
+  <w:abstractNum w:abstractNumId="11" w15:restartNumberingAfterBreak="0">
     <w:nsid w:val="2180677A"/>
     <w:multiLevelType w:val="hybridMultilevel"/>
     <w:tmpl w:val="E4D2E694"/>
@@ -8661,7 +10902,7 @@
       </w:rPr>
     </w:lvl>
   </w:abstractNum>
-  <w:abstractNum w:abstractNumId="9" w15:restartNumberingAfterBreak="0">
+  <w:abstractNum w:abstractNumId="12" w15:restartNumberingAfterBreak="0">
     <w:nsid w:val="232E64F4"/>
     <w:multiLevelType w:val="multilevel"/>
     <w:tmpl w:val="49FEFE5E"/>
@@ -8810,7 +11051,7 @@
       </w:rPr>
     </w:lvl>
   </w:abstractNum>
-  <w:abstractNum w:abstractNumId="10" w15:restartNumberingAfterBreak="0">
+  <w:abstractNum w:abstractNumId="13" w15:restartNumberingAfterBreak="0">
     <w:nsid w:val="28883654"/>
     <w:multiLevelType w:val="multilevel"/>
     <w:tmpl w:val="F4F4D624"/>
@@ -8959,7 +11200,7 @@
       </w:rPr>
     </w:lvl>
   </w:abstractNum>
-  <w:abstractNum w:abstractNumId="11" w15:restartNumberingAfterBreak="0">
+  <w:abstractNum w:abstractNumId="14" w15:restartNumberingAfterBreak="0">
     <w:nsid w:val="28E16810"/>
     <w:multiLevelType w:val="multilevel"/>
     <w:tmpl w:val="09AEBCE6"/>
@@ -9108,7 +11349,7 @@
       </w:rPr>
     </w:lvl>
   </w:abstractNum>
-  <w:abstractNum w:abstractNumId="12" w15:restartNumberingAfterBreak="0">
+  <w:abstractNum w:abstractNumId="15" w15:restartNumberingAfterBreak="0">
     <w:nsid w:val="31402C8E"/>
     <w:multiLevelType w:val="multilevel"/>
     <w:tmpl w:val="170C6BDA"/>
@@ -9257,7 +11498,7 @@
       </w:rPr>
     </w:lvl>
   </w:abstractNum>
-  <w:abstractNum w:abstractNumId="13" w15:restartNumberingAfterBreak="0">
+  <w:abstractNum w:abstractNumId="16" w15:restartNumberingAfterBreak="0">
     <w:nsid w:val="32DF43A0"/>
     <w:multiLevelType w:val="multilevel"/>
     <w:tmpl w:val="1278E3A6"/>
@@ -9406,7 +11647,7 @@
       </w:rPr>
     </w:lvl>
   </w:abstractNum>
-  <w:abstractNum w:abstractNumId="14" w15:restartNumberingAfterBreak="0">
+  <w:abstractNum w:abstractNumId="17" w15:restartNumberingAfterBreak="0">
     <w:nsid w:val="3A226700"/>
     <w:multiLevelType w:val="multilevel"/>
     <w:tmpl w:val="7812BBF6"/>
@@ -9555,7 +11796,7 @@
       </w:rPr>
     </w:lvl>
   </w:abstractNum>
-  <w:abstractNum w:abstractNumId="15" w15:restartNumberingAfterBreak="0">
+  <w:abstractNum w:abstractNumId="18" w15:restartNumberingAfterBreak="0">
     <w:nsid w:val="3A841F76"/>
     <w:multiLevelType w:val="multilevel"/>
     <w:tmpl w:val="772C4614"/>
@@ -9704,7 +11945,7 @@
       </w:rPr>
     </w:lvl>
   </w:abstractNum>
-  <w:abstractNum w:abstractNumId="16" w15:restartNumberingAfterBreak="0">
+  <w:abstractNum w:abstractNumId="19" w15:restartNumberingAfterBreak="0">
     <w:nsid w:val="3EBA1C04"/>
     <w:multiLevelType w:val="multilevel"/>
     <w:tmpl w:val="D95AE0C8"/>
@@ -9853,7 +12094,7 @@
       </w:rPr>
     </w:lvl>
   </w:abstractNum>
-  <w:abstractNum w:abstractNumId="17" w15:restartNumberingAfterBreak="0">
+  <w:abstractNum w:abstractNumId="20" w15:restartNumberingAfterBreak="0">
     <w:nsid w:val="49690380"/>
     <w:multiLevelType w:val="multilevel"/>
     <w:tmpl w:val="C5BE8696"/>
@@ -10002,7 +12243,7 @@
       </w:rPr>
     </w:lvl>
   </w:abstractNum>
-  <w:abstractNum w:abstractNumId="18" w15:restartNumberingAfterBreak="0">
+  <w:abstractNum w:abstractNumId="21" w15:restartNumberingAfterBreak="0">
     <w:nsid w:val="4C370E3E"/>
     <w:multiLevelType w:val="multilevel"/>
     <w:tmpl w:val="1E04F222"/>
@@ -10151,7 +12392,7 @@
       </w:rPr>
     </w:lvl>
   </w:abstractNum>
-  <w:abstractNum w:abstractNumId="19" w15:restartNumberingAfterBreak="0">
+  <w:abstractNum w:abstractNumId="22" w15:restartNumberingAfterBreak="0">
     <w:nsid w:val="53D31084"/>
     <w:multiLevelType w:val="multilevel"/>
     <w:tmpl w:val="767E4724"/>
@@ -10264,7 +12505,7 @@
       </w:pPr>
     </w:lvl>
   </w:abstractNum>
-  <w:abstractNum w:abstractNumId="20" w15:restartNumberingAfterBreak="0">
+  <w:abstractNum w:abstractNumId="23" w15:restartNumberingAfterBreak="0">
     <w:nsid w:val="582D7BC2"/>
     <w:multiLevelType w:val="multilevel"/>
     <w:tmpl w:val="24121A5A"/>
@@ -10413,7 +12654,7 @@
       </w:rPr>
     </w:lvl>
   </w:abstractNum>
-  <w:abstractNum w:abstractNumId="21" w15:restartNumberingAfterBreak="0">
+  <w:abstractNum w:abstractNumId="24" w15:restartNumberingAfterBreak="0">
     <w:nsid w:val="59537E3B"/>
     <w:multiLevelType w:val="multilevel"/>
     <w:tmpl w:val="045EEC0C"/>
@@ -10562,7 +12803,7 @@
       </w:rPr>
     </w:lvl>
   </w:abstractNum>
-  <w:abstractNum w:abstractNumId="22" w15:restartNumberingAfterBreak="0">
+  <w:abstractNum w:abstractNumId="25" w15:restartNumberingAfterBreak="0">
     <w:nsid w:val="5D610B6F"/>
     <w:multiLevelType w:val="multilevel"/>
     <w:tmpl w:val="C8E229DA"/>
@@ -10711,7 +12952,7 @@
       </w:rPr>
     </w:lvl>
   </w:abstractNum>
-  <w:abstractNum w:abstractNumId="23" w15:restartNumberingAfterBreak="0">
+  <w:abstractNum w:abstractNumId="26" w15:restartNumberingAfterBreak="0">
     <w:nsid w:val="5E3E3BA7"/>
     <w:multiLevelType w:val="multilevel"/>
     <w:tmpl w:val="6994B42E"/>
@@ -10860,7 +13101,7 @@
       </w:rPr>
     </w:lvl>
   </w:abstractNum>
-  <w:abstractNum w:abstractNumId="24" w15:restartNumberingAfterBreak="0">
+  <w:abstractNum w:abstractNumId="27" w15:restartNumberingAfterBreak="0">
     <w:nsid w:val="5ED7179D"/>
     <w:multiLevelType w:val="multilevel"/>
     <w:tmpl w:val="2DFECE4A"/>
@@ -11009,7 +13250,7 @@
       </w:rPr>
     </w:lvl>
   </w:abstractNum>
-  <w:abstractNum w:abstractNumId="25" w15:restartNumberingAfterBreak="0">
+  <w:abstractNum w:abstractNumId="28" w15:restartNumberingAfterBreak="0">
     <w:nsid w:val="61D02186"/>
     <w:multiLevelType w:val="multilevel"/>
     <w:tmpl w:val="B1F45130"/>
@@ -11158,7 +13399,7 @@
       </w:rPr>
     </w:lvl>
   </w:abstractNum>
-  <w:abstractNum w:abstractNumId="26" w15:restartNumberingAfterBreak="0">
+  <w:abstractNum w:abstractNumId="29" w15:restartNumberingAfterBreak="0">
     <w:nsid w:val="625F253A"/>
     <w:multiLevelType w:val="multilevel"/>
     <w:tmpl w:val="D56626FA"/>
@@ -11307,7 +13548,7 @@
       </w:rPr>
     </w:lvl>
   </w:abstractNum>
-  <w:abstractNum w:abstractNumId="27" w15:restartNumberingAfterBreak="0">
+  <w:abstractNum w:abstractNumId="30" w15:restartNumberingAfterBreak="0">
     <w:nsid w:val="6D274883"/>
     <w:multiLevelType w:val="multilevel"/>
     <w:tmpl w:val="14C8BD54"/>
@@ -11456,7 +13697,7 @@
       </w:rPr>
     </w:lvl>
   </w:abstractNum>
-  <w:abstractNum w:abstractNumId="28" w15:restartNumberingAfterBreak="0">
+  <w:abstractNum w:abstractNumId="31" w15:restartNumberingAfterBreak="0">
     <w:nsid w:val="6F7F2348"/>
     <w:multiLevelType w:val="multilevel"/>
     <w:tmpl w:val="5324DEB6"/>
@@ -11605,7 +13846,7 @@
       </w:rPr>
     </w:lvl>
   </w:abstractNum>
-  <w:abstractNum w:abstractNumId="29" w15:restartNumberingAfterBreak="0">
+  <w:abstractNum w:abstractNumId="32" w15:restartNumberingAfterBreak="0">
     <w:nsid w:val="6FDA4E4A"/>
     <w:multiLevelType w:val="multilevel"/>
     <w:tmpl w:val="5F20B7BE"/>
@@ -11754,7 +13995,7 @@
       </w:rPr>
     </w:lvl>
   </w:abstractNum>
-  <w:abstractNum w:abstractNumId="30" w15:restartNumberingAfterBreak="0">
+  <w:abstractNum w:abstractNumId="33" w15:restartNumberingAfterBreak="0">
     <w:nsid w:val="704D7E50"/>
     <w:multiLevelType w:val="multilevel"/>
     <w:tmpl w:val="09E63382"/>
@@ -11867,7 +14108,7 @@
       </w:pPr>
     </w:lvl>
   </w:abstractNum>
-  <w:abstractNum w:abstractNumId="31" w15:restartNumberingAfterBreak="0">
+  <w:abstractNum w:abstractNumId="34" w15:restartNumberingAfterBreak="0">
     <w:nsid w:val="72B13BF5"/>
     <w:multiLevelType w:val="multilevel"/>
     <w:tmpl w:val="AC3874E8"/>
@@ -12016,7 +14257,7 @@
       </w:rPr>
     </w:lvl>
   </w:abstractNum>
-  <w:abstractNum w:abstractNumId="32" w15:restartNumberingAfterBreak="0">
+  <w:abstractNum w:abstractNumId="35" w15:restartNumberingAfterBreak="0">
     <w:nsid w:val="748C7C55"/>
     <w:multiLevelType w:val="multilevel"/>
     <w:tmpl w:val="20A83FD4"/>
@@ -12165,7 +14406,7 @@
       </w:rPr>
     </w:lvl>
   </w:abstractNum>
-  <w:abstractNum w:abstractNumId="33" w15:restartNumberingAfterBreak="0">
+  <w:abstractNum w:abstractNumId="36" w15:restartNumberingAfterBreak="0">
     <w:nsid w:val="75591F9C"/>
     <w:multiLevelType w:val="multilevel"/>
     <w:tmpl w:val="A5567EB2"/>
@@ -12314,7 +14555,7 @@
       </w:rPr>
     </w:lvl>
   </w:abstractNum>
-  <w:abstractNum w:abstractNumId="34" w15:restartNumberingAfterBreak="0">
+  <w:abstractNum w:abstractNumId="37" w15:restartNumberingAfterBreak="0">
     <w:nsid w:val="759C3C90"/>
     <w:multiLevelType w:val="multilevel"/>
     <w:tmpl w:val="41CCB09C"/>
@@ -12463,7 +14704,7 @@
       </w:rPr>
     </w:lvl>
   </w:abstractNum>
-  <w:abstractNum w:abstractNumId="35" w15:restartNumberingAfterBreak="0">
+  <w:abstractNum w:abstractNumId="38" w15:restartNumberingAfterBreak="0">
     <w:nsid w:val="77FF3B3F"/>
     <w:multiLevelType w:val="hybridMultilevel"/>
     <w:tmpl w:val="2EFE34AA"/>
@@ -12576,7 +14817,7 @@
       </w:rPr>
     </w:lvl>
   </w:abstractNum>
-  <w:abstractNum w:abstractNumId="36" w15:restartNumberingAfterBreak="0">
+  <w:abstractNum w:abstractNumId="39" w15:restartNumberingAfterBreak="0">
     <w:nsid w:val="7B251592"/>
     <w:multiLevelType w:val="multilevel"/>
     <w:tmpl w:val="4CF6E632"/>
@@ -12725,7 +14966,7 @@
       </w:rPr>
     </w:lvl>
   </w:abstractNum>
-  <w:abstractNum w:abstractNumId="37" w15:restartNumberingAfterBreak="0">
+  <w:abstractNum w:abstractNumId="40" w15:restartNumberingAfterBreak="0">
     <w:nsid w:val="7BFA6AE9"/>
     <w:multiLevelType w:val="multilevel"/>
     <w:tmpl w:val="5DE827EC"/>
@@ -12874,7 +15115,7 @@
       </w:rPr>
     </w:lvl>
   </w:abstractNum>
-  <w:abstractNum w:abstractNumId="38" w15:restartNumberingAfterBreak="0">
+  <w:abstractNum w:abstractNumId="41" w15:restartNumberingAfterBreak="0">
     <w:nsid w:val="7F617EEB"/>
     <w:multiLevelType w:val="multilevel"/>
     <w:tmpl w:val="8C60B0D0"/>
@@ -13024,121 +15265,130 @@
     </w:lvl>
   </w:abstractNum>
   <w:num w:numId="1" w16cid:durableId="2069649446">
+    <w:abstractNumId w:val="38"/>
+  </w:num>
+  <w:num w:numId="2" w16cid:durableId="825782639">
+    <w:abstractNumId w:val="7"/>
+  </w:num>
+  <w:num w:numId="3" w16cid:durableId="414012011">
     <w:abstractNumId w:val="35"/>
   </w:num>
-  <w:num w:numId="2" w16cid:durableId="825782639">
-    <w:abstractNumId w:val="5"/>
-  </w:num>
-  <w:num w:numId="3" w16cid:durableId="414012011">
-    <w:abstractNumId w:val="32"/>
-  </w:num>
   <w:num w:numId="4" w16cid:durableId="262883502">
-    <w:abstractNumId w:val="1"/>
+    <w:abstractNumId w:val="2"/>
   </w:num>
   <w:num w:numId="5" w16cid:durableId="1847791232">
     <w:abstractNumId w:val="0"/>
   </w:num>
   <w:num w:numId="6" w16cid:durableId="1138494187">
+    <w:abstractNumId w:val="34"/>
+  </w:num>
+  <w:num w:numId="7" w16cid:durableId="1654138643">
+    <w:abstractNumId w:val="41"/>
+  </w:num>
+  <w:num w:numId="8" w16cid:durableId="106898086">
+    <w:abstractNumId w:val="16"/>
+  </w:num>
+  <w:num w:numId="9" w16cid:durableId="989135257">
     <w:abstractNumId w:val="31"/>
   </w:num>
-  <w:num w:numId="7" w16cid:durableId="1654138643">
-    <w:abstractNumId w:val="38"/>
+  <w:num w:numId="10" w16cid:durableId="1576472402">
+    <w:abstractNumId w:val="30"/>
   </w:num>
-  <w:num w:numId="8" w16cid:durableId="106898086">
+  <w:num w:numId="11" w16cid:durableId="1153065515">
+    <w:abstractNumId w:val="32"/>
+  </w:num>
+  <w:num w:numId="12" w16cid:durableId="1737976444">
+    <w:abstractNumId w:val="26"/>
+  </w:num>
+  <w:num w:numId="13" w16cid:durableId="1421297345">
+    <w:abstractNumId w:val="29"/>
+  </w:num>
+  <w:num w:numId="14" w16cid:durableId="836648845">
+    <w:abstractNumId w:val="14"/>
+  </w:num>
+  <w:num w:numId="15" w16cid:durableId="679088471">
+    <w:abstractNumId w:val="17"/>
+  </w:num>
+  <w:num w:numId="16" w16cid:durableId="70857447">
+    <w:abstractNumId w:val="25"/>
+  </w:num>
+  <w:num w:numId="17" w16cid:durableId="1778213930">
+    <w:abstractNumId w:val="36"/>
+  </w:num>
+  <w:num w:numId="18" w16cid:durableId="716658410">
+    <w:abstractNumId w:val="11"/>
+  </w:num>
+  <w:num w:numId="19" w16cid:durableId="2029796988">
+    <w:abstractNumId w:val="18"/>
+  </w:num>
+  <w:num w:numId="20" w16cid:durableId="363675446">
+    <w:abstractNumId w:val="28"/>
+  </w:num>
+  <w:num w:numId="21" w16cid:durableId="1621447262">
+    <w:abstractNumId w:val="20"/>
+  </w:num>
+  <w:num w:numId="22" w16cid:durableId="340938873">
+    <w:abstractNumId w:val="12"/>
+  </w:num>
+  <w:num w:numId="23" w16cid:durableId="832141462">
+    <w:abstractNumId w:val="33"/>
+  </w:num>
+  <w:num w:numId="24" w16cid:durableId="1984894803">
+    <w:abstractNumId w:val="37"/>
+  </w:num>
+  <w:num w:numId="25" w16cid:durableId="1985968268">
+    <w:abstractNumId w:val="40"/>
+  </w:num>
+  <w:num w:numId="26" w16cid:durableId="1197965082">
+    <w:abstractNumId w:val="27"/>
+  </w:num>
+  <w:num w:numId="27" w16cid:durableId="672610335">
+    <w:abstractNumId w:val="24"/>
+  </w:num>
+  <w:num w:numId="28" w16cid:durableId="37702360">
+    <w:abstractNumId w:val="19"/>
+  </w:num>
+  <w:num w:numId="29" w16cid:durableId="1145850917">
+    <w:abstractNumId w:val="3"/>
+  </w:num>
+  <w:num w:numId="30" w16cid:durableId="1417484050">
+    <w:abstractNumId w:val="39"/>
+  </w:num>
+  <w:num w:numId="31" w16cid:durableId="2096969866">
+    <w:abstractNumId w:val="15"/>
+  </w:num>
+  <w:num w:numId="32" w16cid:durableId="476608453">
+    <w:abstractNumId w:val="23"/>
+  </w:num>
+  <w:num w:numId="33" w16cid:durableId="1766878996">
+    <w:abstractNumId w:val="6"/>
+  </w:num>
+  <w:num w:numId="34" w16cid:durableId="1926380579">
+    <w:abstractNumId w:val="10"/>
+  </w:num>
+  <w:num w:numId="35" w16cid:durableId="1228682413">
+    <w:abstractNumId w:val="21"/>
+  </w:num>
+  <w:num w:numId="36" w16cid:durableId="1122266880">
+    <w:abstractNumId w:val="8"/>
+  </w:num>
+  <w:num w:numId="37" w16cid:durableId="1561018554">
     <w:abstractNumId w:val="13"/>
   </w:num>
-  <w:num w:numId="9" w16cid:durableId="989135257">
-    <w:abstractNumId w:val="28"/>
-  </w:num>
-  <w:num w:numId="10" w16cid:durableId="1576472402">
-    <w:abstractNumId w:val="27"/>
-  </w:num>
-  <w:num w:numId="11" w16cid:durableId="1153065515">
-    <w:abstractNumId w:val="29"/>
-  </w:num>
-  <w:num w:numId="12" w16cid:durableId="1737976444">
-    <w:abstractNumId w:val="23"/>
-  </w:num>
-  <w:num w:numId="13" w16cid:durableId="1421297345">
-    <w:abstractNumId w:val="26"/>
-  </w:num>
-  <w:num w:numId="14" w16cid:durableId="836648845">
-    <w:abstractNumId w:val="11"/>
-  </w:num>
-  <w:num w:numId="15" w16cid:durableId="679088471">
-    <w:abstractNumId w:val="14"/>
-  </w:num>
-  <w:num w:numId="16" w16cid:durableId="70857447">
+  <w:num w:numId="38" w16cid:durableId="1217274218">
     <w:abstractNumId w:val="22"/>
   </w:num>
-  <w:num w:numId="17" w16cid:durableId="1778213930">
-    <w:abstractNumId w:val="33"/>
+  <w:num w:numId="39" w16cid:durableId="1982540400">
+    <w:abstractNumId w:val="5"/>
   </w:num>
-  <w:num w:numId="18" w16cid:durableId="716658410">
-    <w:abstractNumId w:val="8"/>
-  </w:num>
-  <w:num w:numId="19" w16cid:durableId="2029796988">
-    <w:abstractNumId w:val="15"/>
-  </w:num>
-  <w:num w:numId="20" w16cid:durableId="363675446">
-    <w:abstractNumId w:val="25"/>
-  </w:num>
-  <w:num w:numId="21" w16cid:durableId="1621447262">
-    <w:abstractNumId w:val="17"/>
-  </w:num>
-  <w:num w:numId="22" w16cid:durableId="340938873">
-    <w:abstractNumId w:val="9"/>
-  </w:num>
-  <w:num w:numId="23" w16cid:durableId="832141462">
-    <w:abstractNumId w:val="30"/>
-  </w:num>
-  <w:num w:numId="24" w16cid:durableId="1984894803">
-    <w:abstractNumId w:val="34"/>
-  </w:num>
-  <w:num w:numId="25" w16cid:durableId="1985968268">
-    <w:abstractNumId w:val="37"/>
-  </w:num>
-  <w:num w:numId="26" w16cid:durableId="1197965082">
-    <w:abstractNumId w:val="24"/>
-  </w:num>
-  <w:num w:numId="27" w16cid:durableId="672610335">
-    <w:abstractNumId w:val="21"/>
-  </w:num>
-  <w:num w:numId="28" w16cid:durableId="37702360">
-    <w:abstractNumId w:val="16"/>
-  </w:num>
-  <w:num w:numId="29" w16cid:durableId="1145850917">
-    <w:abstractNumId w:val="2"/>
-  </w:num>
-  <w:num w:numId="30" w16cid:durableId="1417484050">
-    <w:abstractNumId w:val="36"/>
-  </w:num>
-  <w:num w:numId="31" w16cid:durableId="2096969866">
-    <w:abstractNumId w:val="12"/>
-  </w:num>
-  <w:num w:numId="32" w16cid:durableId="476608453">
-    <w:abstractNumId w:val="20"/>
-  </w:num>
-  <w:num w:numId="33" w16cid:durableId="1766878996">
+  <w:num w:numId="40" w16cid:durableId="1457065802">
     <w:abstractNumId w:val="4"/>
   </w:num>
-  <w:num w:numId="34" w16cid:durableId="1926380579">
-    <w:abstractNumId w:val="7"/>
+  <w:num w:numId="41" w16cid:durableId="2082167027">
+    <w:abstractNumId w:val="1"/>
   </w:num>
-  <w:num w:numId="35" w16cid:durableId="1228682413">
-    <w:abstractNumId w:val="18"/>
-  </w:num>
-  <w:num w:numId="36" w16cid:durableId="1122266880">
-    <w:abstractNumId w:val="6"/>
-  </w:num>
-  <w:num w:numId="37" w16cid:durableId="1561018554">
-    <w:abstractNumId w:val="10"/>
-  </w:num>
-  <w:num w:numId="38" w16cid:durableId="1217274218">
-    <w:abstractNumId w:val="19"/>
-  </w:num>
-  <w:num w:numId="39" w16cid:durableId="1982540400">
-    <w:abstractNumId w:val="3"/>
+  <w:num w:numId="42" w16cid:durableId="962268348">
+    <w:abstractNumId w:val="9"/>
   </w:num>
 </w:numbering>
 </file>
@@ -13745,7 +15995,6 @@
   <w:style w:type="character" w:default="1" w:styleId="DefaultParagraphFont">
     <w:name w:val="Default Paragraph Font"/>
     <w:uiPriority w:val="1"/>
-    <w:semiHidden/>
     <w:unhideWhenUsed/>
   </w:style>
   <w:style w:type="table" w:default="1" w:styleId="TableNormal">

</xml_diff>